<commit_message>
Report: portrait pages, Times New Roman, plain styles
</commit_message>
<xml_diff>
--- a/docs/report.docx
+++ b/docs/report.docx
@@ -11,9 +11,6 @@
         <w:rPr>
           <w:b/>
           <w:bCs/>
-          <w:color w:val="1F3A5F"/>
-          <w:sz w:val="40"/>
-          <w:szCs w:val="40"/>
         </w:rPr>
         <w:t xml:space="preserve">KIM Agents</w:t>
       </w:r>
@@ -24,18 +21,11 @@
         <w:jc w:val="center"/>
       </w:pPr>
       <w:r>
-        <w:rPr>
-          <w:sz w:val="26"/>
-          <w:szCs w:val="26"/>
-        </w:rPr>
         <w:t xml:space="preserve">A multi-agent system that builds a personal test for a teacher</w:t>
       </w:r>
     </w:p>
     <w:p>
       <w:pPr>
-        <w:pBdr>
-          <w:bottom w:val="single" w:color="8A9BB0" w:sz="6" w:space="8"/>
-        </w:pBdr>
         <w:spacing w:after="300"/>
         <w:jc w:val="center"/>
       </w:pPr>
@@ -43,9 +33,6 @@
         <w:rPr>
           <w:i/>
           <w:iCs/>
-          <w:color w:val="555555"/>
-          <w:sz w:val="20"/>
-          <w:szCs w:val="20"/>
         </w:rPr>
         <w:t xml:space="preserve">Master's course project report. Thesis: Multimodal Emotional AI system for teachers' professional assessment (EmotionalAI platform)</w:t>
       </w:r>
@@ -194,13 +181,6 @@
           <w:numId w:val="2"/>
         </w:numPr>
         <w:spacing w:after="80"/>
-        <w:sectPr>
-          <w:footerReference w:type="default" r:id="rId6"/>
-          <w:pgSz w:w="11906" w:h="16838" w:orient="portrait"/>
-          <w:pgMar w:top="1300" w:right="1300" w:bottom="1300" w:left="1300" w:header="708" w:footer="708" w:gutter="0"/>
-          <w:pgNumType/>
-          <w:docGrid w:linePitch="360"/>
-        </w:sectPr>
       </w:pPr>
       <w:r>
         <w:rPr>
@@ -236,7 +216,7 @@
       <w:r>
         <w:drawing>
           <wp:inline distT="0" distB="0" distL="0" distR="0">
-            <wp:extent cx="7905750" cy="4371975"/>
+            <wp:extent cx="5715000" cy="3162300"/>
             <wp:effectExtent t="0" r="0" b="0" l="0"/>
             <wp:docPr id="1" name="diagram" descr="KIM Agents architecture diagram" title="Architecture"/>
             <wp:cNvGraphicFramePr>
@@ -252,7 +232,7 @@
                     </pic:cNvPicPr>
                   </pic:nvPicPr>
                   <pic:blipFill>
-                    <a:blip r:embed="rId10" cstate="none"/>
+                    <a:blip r:embed="rId8" cstate="none"/>
                     <a:srcRect/>
                     <a:stretch>
                       <a:fillRect/>
@@ -261,7 +241,7 @@
                   <pic:spPr bwMode="auto">
                     <a:xfrm>
                       <a:off x="0" y="0"/>
-                      <a:ext cx="7905750" cy="4371975"/>
+                      <a:ext cx="5715000" cy="3162300"/>
                     </a:xfrm>
                     <a:prstGeom prst="rect">
                       <a:avLst/>
@@ -283,8 +263,6 @@
         <w:rPr>
           <w:i/>
           <w:iCs/>
-          <w:sz w:val="20"/>
-          <w:szCs w:val="20"/>
         </w:rPr>
         <w:t xml:space="preserve">Figure 1. Agents, links, tools and message types of KIM Agents.</w:t>
       </w:r>
@@ -315,7 +293,7 @@
     </w:p>
     <w:tbl>
       <w:tblPr>
-        <w:tblW w:type="dxa" w:w="12700"/>
+        <w:tblW w:type="dxa" w:w="9026"/>
         <w:tblBorders>
           <w:top w:val="single" w:color="auto" w:sz="4"/>
           <w:left w:val="single" w:color="auto" w:sz="4"/>
@@ -326,12 +304,12 @@
         </w:tblBorders>
       </w:tblPr>
       <w:tblGrid>
-        <w:gridCol w:w="1700"/>
-        <w:gridCol w:w="2300"/>
-        <w:gridCol w:w="1900"/>
-        <w:gridCol w:w="1900"/>
-        <w:gridCol w:w="2300"/>
-        <w:gridCol w:w="2600"/>
+        <w:gridCol w:w="1350"/>
+        <w:gridCol w:w="1564"/>
+        <w:gridCol w:w="1208"/>
+        <w:gridCol w:w="1350"/>
+        <w:gridCol w:w="1777"/>
+        <w:gridCol w:w="1777"/>
       </w:tblGrid>
       <w:tr>
         <w:trPr>
@@ -339,14 +317,13 @@
         </w:trPr>
         <w:tc>
           <w:tcPr>
-            <w:tcW w:type="dxa" w:w="1700"/>
-            <w:tcBorders>
-              <w:top w:val="single" w:color="8A9BB0" w:sz="4"/>
-              <w:left w:val="single" w:color="8A9BB0" w:sz="4"/>
-              <w:bottom w:val="single" w:color="8A9BB0" w:sz="4"/>
-              <w:right w:val="single" w:color="8A9BB0" w:sz="4"/>
-            </w:tcBorders>
-            <w:shd w:fill="DCE8F7" w:color="auto" w:val="clear"/>
+            <w:tcW w:type="dxa" w:w="1350"/>
+            <w:tcBorders>
+              <w:top w:val="single"/>
+              <w:left w:val="single"/>
+              <w:bottom w:val="single"/>
+              <w:right w:val="single"/>
+            </w:tcBorders>
             <w:tcMar>
               <w:top w:type="dxa" w:w="60"/>
               <w:left w:type="dxa" w:w="90"/>
@@ -359,8 +336,8 @@
               <w:rPr>
                 <w:b/>
                 <w:bCs/>
-                <w:sz w:val="18"/>
-                <w:szCs w:val="18"/>
+                <w:sz w:val="20"/>
+                <w:szCs w:val="20"/>
               </w:rPr>
               <w:t xml:space="preserve">Agent</w:t>
             </w:r>
@@ -368,14 +345,13 @@
         </w:tc>
         <w:tc>
           <w:tcPr>
-            <w:tcW w:type="dxa" w:w="2300"/>
-            <w:tcBorders>
-              <w:top w:val="single" w:color="8A9BB0" w:sz="4"/>
-              <w:left w:val="single" w:color="8A9BB0" w:sz="4"/>
-              <w:bottom w:val="single" w:color="8A9BB0" w:sz="4"/>
-              <w:right w:val="single" w:color="8A9BB0" w:sz="4"/>
-            </w:tcBorders>
-            <w:shd w:fill="DCE8F7" w:color="auto" w:val="clear"/>
+            <w:tcW w:type="dxa" w:w="1564"/>
+            <w:tcBorders>
+              <w:top w:val="single"/>
+              <w:left w:val="single"/>
+              <w:bottom w:val="single"/>
+              <w:right w:val="single"/>
+            </w:tcBorders>
             <w:tcMar>
               <w:top w:type="dxa" w:w="60"/>
               <w:left w:type="dxa" w:w="90"/>
@@ -388,8 +364,8 @@
               <w:rPr>
                 <w:b/>
                 <w:bCs/>
-                <w:sz w:val="18"/>
-                <w:szCs w:val="18"/>
+                <w:sz w:val="20"/>
+                <w:szCs w:val="20"/>
               </w:rPr>
               <w:t xml:space="preserve">Role</w:t>
             </w:r>
@@ -397,14 +373,13 @@
         </w:tc>
         <w:tc>
           <w:tcPr>
-            <w:tcW w:type="dxa" w:w="1900"/>
-            <w:tcBorders>
-              <w:top w:val="single" w:color="8A9BB0" w:sz="4"/>
-              <w:left w:val="single" w:color="8A9BB0" w:sz="4"/>
-              <w:bottom w:val="single" w:color="8A9BB0" w:sz="4"/>
-              <w:right w:val="single" w:color="8A9BB0" w:sz="4"/>
-            </w:tcBorders>
-            <w:shd w:fill="DCE8F7" w:color="auto" w:val="clear"/>
+            <w:tcW w:type="dxa" w:w="1208"/>
+            <w:tcBorders>
+              <w:top w:val="single"/>
+              <w:left w:val="single"/>
+              <w:bottom w:val="single"/>
+              <w:right w:val="single"/>
+            </w:tcBorders>
             <w:tcMar>
               <w:top w:type="dxa" w:w="60"/>
               <w:left w:type="dxa" w:w="90"/>
@@ -417,8 +392,8 @@
               <w:rPr>
                 <w:b/>
                 <w:bCs/>
-                <w:sz w:val="18"/>
-                <w:szCs w:val="18"/>
+                <w:sz w:val="20"/>
+                <w:szCs w:val="20"/>
               </w:rPr>
               <w:t xml:space="preserve">Input</w:t>
             </w:r>
@@ -426,14 +401,13 @@
         </w:tc>
         <w:tc>
           <w:tcPr>
-            <w:tcW w:type="dxa" w:w="1900"/>
-            <w:tcBorders>
-              <w:top w:val="single" w:color="8A9BB0" w:sz="4"/>
-              <w:left w:val="single" w:color="8A9BB0" w:sz="4"/>
-              <w:bottom w:val="single" w:color="8A9BB0" w:sz="4"/>
-              <w:right w:val="single" w:color="8A9BB0" w:sz="4"/>
-            </w:tcBorders>
-            <w:shd w:fill="DCE8F7" w:color="auto" w:val="clear"/>
+            <w:tcW w:type="dxa" w:w="1350"/>
+            <w:tcBorders>
+              <w:top w:val="single"/>
+              <w:left w:val="single"/>
+              <w:bottom w:val="single"/>
+              <w:right w:val="single"/>
+            </w:tcBorders>
             <w:tcMar>
               <w:top w:type="dxa" w:w="60"/>
               <w:left w:type="dxa" w:w="90"/>
@@ -446,8 +420,8 @@
               <w:rPr>
                 <w:b/>
                 <w:bCs/>
-                <w:sz w:val="18"/>
-                <w:szCs w:val="18"/>
+                <w:sz w:val="20"/>
+                <w:szCs w:val="20"/>
               </w:rPr>
               <w:t xml:space="preserve">Output</w:t>
             </w:r>
@@ -455,14 +429,13 @@
         </w:tc>
         <w:tc>
           <w:tcPr>
-            <w:tcW w:type="dxa" w:w="2300"/>
-            <w:tcBorders>
-              <w:top w:val="single" w:color="8A9BB0" w:sz="4"/>
-              <w:left w:val="single" w:color="8A9BB0" w:sz="4"/>
-              <w:bottom w:val="single" w:color="8A9BB0" w:sz="4"/>
-              <w:right w:val="single" w:color="8A9BB0" w:sz="4"/>
-            </w:tcBorders>
-            <w:shd w:fill="DCE8F7" w:color="auto" w:val="clear"/>
+            <w:tcW w:type="dxa" w:w="1777"/>
+            <w:tcBorders>
+              <w:top w:val="single"/>
+              <w:left w:val="single"/>
+              <w:bottom w:val="single"/>
+              <w:right w:val="single"/>
+            </w:tcBorders>
             <w:tcMar>
               <w:top w:type="dxa" w:w="60"/>
               <w:left w:type="dxa" w:w="90"/>
@@ -475,8 +448,8 @@
               <w:rPr>
                 <w:b/>
                 <w:bCs/>
-                <w:sz w:val="18"/>
-                <w:szCs w:val="18"/>
+                <w:sz w:val="20"/>
+                <w:szCs w:val="20"/>
               </w:rPr>
               <w:t xml:space="preserve">Tools</w:t>
             </w:r>
@@ -484,14 +457,13 @@
         </w:tc>
         <w:tc>
           <w:tcPr>
-            <w:tcW w:type="dxa" w:w="2600"/>
-            <w:tcBorders>
-              <w:top w:val="single" w:color="8A9BB0" w:sz="4"/>
-              <w:left w:val="single" w:color="8A9BB0" w:sz="4"/>
-              <w:bottom w:val="single" w:color="8A9BB0" w:sz="4"/>
-              <w:right w:val="single" w:color="8A9BB0" w:sz="4"/>
-            </w:tcBorders>
-            <w:shd w:fill="DCE8F7" w:color="auto" w:val="clear"/>
+            <w:tcW w:type="dxa" w:w="1777"/>
+            <w:tcBorders>
+              <w:top w:val="single"/>
+              <w:left w:val="single"/>
+              <w:bottom w:val="single"/>
+              <w:right w:val="single"/>
+            </w:tcBorders>
             <w:tcMar>
               <w:top w:type="dxa" w:w="60"/>
               <w:left w:type="dxa" w:w="90"/>
@@ -504,8 +476,8 @@
               <w:rPr>
                 <w:b/>
                 <w:bCs/>
-                <w:sz w:val="18"/>
-                <w:szCs w:val="18"/>
+                <w:sz w:val="20"/>
+                <w:szCs w:val="20"/>
               </w:rPr>
               <w:t xml:space="preserve">Done when</w:t>
             </w:r>
@@ -518,12 +490,12 @@
         </w:trPr>
         <w:tc>
           <w:tcPr>
-            <w:tcW w:type="dxa" w:w="1700"/>
-            <w:tcBorders>
-              <w:top w:val="single" w:color="8A9BB0" w:sz="4"/>
-              <w:left w:val="single" w:color="8A9BB0" w:sz="4"/>
-              <w:bottom w:val="single" w:color="8A9BB0" w:sz="4"/>
-              <w:right w:val="single" w:color="8A9BB0" w:sz="4"/>
+            <w:tcW w:type="dxa" w:w="1350"/>
+            <w:tcBorders>
+              <w:top w:val="single"/>
+              <w:left w:val="single"/>
+              <w:bottom w:val="single"/>
+              <w:right w:val="single"/>
             </w:tcBorders>
             <w:tcMar>
               <w:top w:type="dxa" w:w="60"/>
@@ -537,8 +509,8 @@
               <w:rPr>
                 <w:b/>
                 <w:bCs/>
-                <w:sz w:val="18"/>
-                <w:szCs w:val="18"/>
+                <w:sz w:val="20"/>
+                <w:szCs w:val="20"/>
               </w:rPr>
               <w:t xml:space="preserve">Profile Analyst</w:t>
             </w:r>
@@ -546,27 +518,27 @@
         </w:tc>
         <w:tc>
           <w:tcPr>
-            <w:tcW w:type="dxa" w:w="2300"/>
-            <w:tcBorders>
-              <w:top w:val="single" w:color="8A9BB0" w:sz="4"/>
-              <w:left w:val="single" w:color="8A9BB0" w:sz="4"/>
-              <w:bottom w:val="single" w:color="8A9BB0" w:sz="4"/>
-              <w:right w:val="single" w:color="8A9BB0" w:sz="4"/>
-            </w:tcBorders>
-            <w:tcMar>
-              <w:top w:type="dxa" w:w="60"/>
-              <w:left w:type="dxa" w:w="90"/>
-              <w:bottom w:type="dxa" w:w="60"/>
-              <w:right w:type="dxa" w:w="90"/>
-            </w:tcMar>
-          </w:tcPr>
-          <w:p>
-            <w:r>
-              <w:rPr>
-                <w:b w:val="false"/>
-                <w:bCs w:val="false"/>
-                <w:sz w:val="18"/>
-                <w:szCs w:val="18"/>
+            <w:tcW w:type="dxa" w:w="1564"/>
+            <w:tcBorders>
+              <w:top w:val="single"/>
+              <w:left w:val="single"/>
+              <w:bottom w:val="single"/>
+              <w:right w:val="single"/>
+            </w:tcBorders>
+            <w:tcMar>
+              <w:top w:type="dxa" w:w="60"/>
+              <w:left w:type="dxa" w:w="90"/>
+              <w:bottom w:type="dxa" w:w="60"/>
+              <w:right w:type="dxa" w:w="90"/>
+            </w:tcMar>
+          </w:tcPr>
+          <w:p>
+            <w:r>
+              <w:rPr>
+                <w:b w:val="false"/>
+                <w:bCs w:val="false"/>
+                <w:sz w:val="20"/>
+                <w:szCs w:val="20"/>
               </w:rPr>
               <w:t xml:space="preserve">Finds weak areas in the self-assessment and plans the test</w:t>
             </w:r>
@@ -574,27 +546,27 @@
         </w:tc>
         <w:tc>
           <w:tcPr>
-            <w:tcW w:type="dxa" w:w="1900"/>
-            <w:tcBorders>
-              <w:top w:val="single" w:color="8A9BB0" w:sz="4"/>
-              <w:left w:val="single" w:color="8A9BB0" w:sz="4"/>
-              <w:bottom w:val="single" w:color="8A9BB0" w:sz="4"/>
-              <w:right w:val="single" w:color="8A9BB0" w:sz="4"/>
-            </w:tcBorders>
-            <w:tcMar>
-              <w:top w:type="dxa" w:w="60"/>
-              <w:left w:type="dxa" w:w="90"/>
-              <w:bottom w:type="dxa" w:w="60"/>
-              <w:right w:type="dxa" w:w="90"/>
-            </w:tcMar>
-          </w:tcPr>
-          <w:p>
-            <w:r>
-              <w:rPr>
-                <w:b w:val="false"/>
-                <w:bCs w:val="false"/>
-                <w:sz w:val="18"/>
-                <w:szCs w:val="18"/>
+            <w:tcW w:type="dxa" w:w="1208"/>
+            <w:tcBorders>
+              <w:top w:val="single"/>
+              <w:left w:val="single"/>
+              <w:bottom w:val="single"/>
+              <w:right w:val="single"/>
+            </w:tcBorders>
+            <w:tcMar>
+              <w:top w:type="dxa" w:w="60"/>
+              <w:left w:type="dxa" w:w="90"/>
+              <w:bottom w:type="dxa" w:w="60"/>
+              <w:right w:type="dxa" w:w="90"/>
+            </w:tcMar>
+          </w:tcPr>
+          <w:p>
+            <w:r>
+              <w:rPr>
+                <w:b w:val="false"/>
+                <w:bCs w:val="false"/>
+                <w:sz w:val="20"/>
+                <w:szCs w:val="20"/>
               </w:rPr>
               <w:t xml:space="preserve">Teacher profile (22 answers, 0 to 4)</w:t>
             </w:r>
@@ -602,27 +574,27 @@
         </w:tc>
         <w:tc>
           <w:tcPr>
-            <w:tcW w:type="dxa" w:w="1900"/>
-            <w:tcBorders>
-              <w:top w:val="single" w:color="8A9BB0" w:sz="4"/>
-              <w:left w:val="single" w:color="8A9BB0" w:sz="4"/>
-              <w:bottom w:val="single" w:color="8A9BB0" w:sz="4"/>
-              <w:right w:val="single" w:color="8A9BB0" w:sz="4"/>
-            </w:tcBorders>
-            <w:tcMar>
-              <w:top w:type="dxa" w:w="60"/>
-              <w:left w:type="dxa" w:w="90"/>
-              <w:bottom w:type="dxa" w:w="60"/>
-              <w:right w:type="dxa" w:w="90"/>
-            </w:tcMar>
-          </w:tcPr>
-          <w:p>
-            <w:r>
-              <w:rPr>
-                <w:b w:val="false"/>
-                <w:bCs w:val="false"/>
-                <w:sz w:val="18"/>
-                <w:szCs w:val="18"/>
+            <w:tcW w:type="dxa" w:w="1350"/>
+            <w:tcBorders>
+              <w:top w:val="single"/>
+              <w:left w:val="single"/>
+              <w:bottom w:val="single"/>
+              <w:right w:val="single"/>
+            </w:tcBorders>
+            <w:tcMar>
+              <w:top w:type="dxa" w:w="60"/>
+              <w:left w:type="dxa" w:w="90"/>
+              <w:bottom w:type="dxa" w:w="60"/>
+              <w:right w:type="dxa" w:w="90"/>
+            </w:tcMar>
+          </w:tcPr>
+          <w:p>
+            <w:r>
+              <w:rPr>
+                <w:b w:val="false"/>
+                <w:bCs w:val="false"/>
+                <w:sz w:val="20"/>
+                <w:szCs w:val="20"/>
               </w:rPr>
               <w:t xml:space="preserve">TestBlueprint (cells: competence, level, item type, count)</w:t>
             </w:r>
@@ -630,27 +602,27 @@
         </w:tc>
         <w:tc>
           <w:tcPr>
-            <w:tcW w:type="dxa" w:w="2300"/>
-            <w:tcBorders>
-              <w:top w:val="single" w:color="8A9BB0" w:sz="4"/>
-              <w:left w:val="single" w:color="8A9BB0" w:sz="4"/>
-              <w:bottom w:val="single" w:color="8A9BB0" w:sz="4"/>
-              <w:right w:val="single" w:color="8A9BB0" w:sz="4"/>
-            </w:tcBorders>
-            <w:tcMar>
-              <w:top w:type="dxa" w:w="60"/>
-              <w:left w:type="dxa" w:w="90"/>
-              <w:bottom w:type="dxa" w:w="60"/>
-              <w:right w:type="dxa" w:w="90"/>
-            </w:tcMar>
-          </w:tcPr>
-          <w:p>
-            <w:r>
-              <w:rPr>
-                <w:b w:val="false"/>
-                <w:bCs w:val="false"/>
-                <w:sz w:val="18"/>
-                <w:szCs w:val="18"/>
+            <w:tcW w:type="dxa" w:w="1777"/>
+            <w:tcBorders>
+              <w:top w:val="single"/>
+              <w:left w:val="single"/>
+              <w:bottom w:val="single"/>
+              <w:right w:val="single"/>
+            </w:tcBorders>
+            <w:tcMar>
+              <w:top w:type="dxa" w:w="60"/>
+              <w:left w:type="dxa" w:w="90"/>
+              <w:bottom w:type="dxa" w:w="60"/>
+              <w:right w:type="dxa" w:w="90"/>
+            </w:tcMar>
+          </w:tcPr>
+          <w:p>
+            <w:r>
+              <w:rPr>
+                <w:b w:val="false"/>
+                <w:bCs w:val="false"/>
+                <w:sz w:val="20"/>
+                <w:szCs w:val="20"/>
               </w:rPr>
               <w:t xml:space="preserve">load_profile, get_framework_overview</w:t>
             </w:r>
@@ -658,27 +630,27 @@
         </w:tc>
         <w:tc>
           <w:tcPr>
-            <w:tcW w:type="dxa" w:w="2600"/>
-            <w:tcBorders>
-              <w:top w:val="single" w:color="8A9BB0" w:sz="4"/>
-              <w:left w:val="single" w:color="8A9BB0" w:sz="4"/>
-              <w:bottom w:val="single" w:color="8A9BB0" w:sz="4"/>
-              <w:right w:val="single" w:color="8A9BB0" w:sz="4"/>
-            </w:tcBorders>
-            <w:tcMar>
-              <w:top w:type="dxa" w:w="60"/>
-              <w:left w:type="dxa" w:w="90"/>
-              <w:bottom w:type="dxa" w:w="60"/>
-              <w:right w:type="dxa" w:w="90"/>
-            </w:tcMar>
-          </w:tcPr>
-          <w:p>
-            <w:r>
-              <w:rPr>
-                <w:b w:val="false"/>
-                <w:bCs w:val="false"/>
-                <w:sz w:val="18"/>
-                <w:szCs w:val="18"/>
+            <w:tcW w:type="dxa" w:w="1777"/>
+            <w:tcBorders>
+              <w:top w:val="single"/>
+              <w:left w:val="single"/>
+              <w:bottom w:val="single"/>
+              <w:right w:val="single"/>
+            </w:tcBorders>
+            <w:tcMar>
+              <w:top w:type="dxa" w:w="60"/>
+              <w:left w:type="dxa" w:w="90"/>
+              <w:bottom w:type="dxa" w:w="60"/>
+              <w:right w:type="dxa" w:w="90"/>
+            </w:tcMar>
+          </w:tcPr>
+          <w:p>
+            <w:r>
+              <w:rPr>
+                <w:b w:val="false"/>
+                <w:bCs w:val="false"/>
+                <w:sz w:val="20"/>
+                <w:szCs w:val="20"/>
               </w:rPr>
               <w:t xml:space="preserve">Blueprint is valid and covers the weakest areas</w:t>
             </w:r>
@@ -691,12 +663,12 @@
         </w:trPr>
         <w:tc>
           <w:tcPr>
-            <w:tcW w:type="dxa" w:w="1700"/>
-            <w:tcBorders>
-              <w:top w:val="single" w:color="8A9BB0" w:sz="4"/>
-              <w:left w:val="single" w:color="8A9BB0" w:sz="4"/>
-              <w:bottom w:val="single" w:color="8A9BB0" w:sz="4"/>
-              <w:right w:val="single" w:color="8A9BB0" w:sz="4"/>
+            <w:tcW w:type="dxa" w:w="1350"/>
+            <w:tcBorders>
+              <w:top w:val="single"/>
+              <w:left w:val="single"/>
+              <w:bottom w:val="single"/>
+              <w:right w:val="single"/>
             </w:tcBorders>
             <w:tcMar>
               <w:top w:type="dxa" w:w="60"/>
@@ -710,8 +682,8 @@
               <w:rPr>
                 <w:b/>
                 <w:bCs/>
-                <w:sz w:val="18"/>
-                <w:szCs w:val="18"/>
+                <w:sz w:val="20"/>
+                <w:szCs w:val="20"/>
               </w:rPr>
               <w:t xml:space="preserve">Item Writer</w:t>
             </w:r>
@@ -719,27 +691,27 @@
         </w:tc>
         <w:tc>
           <w:tcPr>
-            <w:tcW w:type="dxa" w:w="2300"/>
-            <w:tcBorders>
-              <w:top w:val="single" w:color="8A9BB0" w:sz="4"/>
-              <w:left w:val="single" w:color="8A9BB0" w:sz="4"/>
-              <w:bottom w:val="single" w:color="8A9BB0" w:sz="4"/>
-              <w:right w:val="single" w:color="8A9BB0" w:sz="4"/>
-            </w:tcBorders>
-            <w:tcMar>
-              <w:top w:type="dxa" w:w="60"/>
-              <w:left w:type="dxa" w:w="90"/>
-              <w:bottom w:type="dxa" w:w="60"/>
-              <w:right w:type="dxa" w:w="90"/>
-            </w:tcMar>
-          </w:tcPr>
-          <w:p>
-            <w:r>
-              <w:rPr>
-                <w:b w:val="false"/>
-                <w:bCs w:val="false"/>
-                <w:sz w:val="18"/>
-                <w:szCs w:val="18"/>
+            <w:tcW w:type="dxa" w:w="1564"/>
+            <w:tcBorders>
+              <w:top w:val="single"/>
+              <w:left w:val="single"/>
+              <w:bottom w:val="single"/>
+              <w:right w:val="single"/>
+            </w:tcBorders>
+            <w:tcMar>
+              <w:top w:type="dxa" w:w="60"/>
+              <w:left w:type="dxa" w:w="90"/>
+              <w:bottom w:type="dxa" w:w="60"/>
+              <w:right w:type="dxa" w:w="90"/>
+            </w:tcMar>
+          </w:tcPr>
+          <w:p>
+            <w:r>
+              <w:rPr>
+                <w:b w:val="false"/>
+                <w:bCs w:val="false"/>
+                <w:sz w:val="20"/>
+                <w:szCs w:val="20"/>
               </w:rPr>
               <w:t xml:space="preserve">Writes the case, question, key and explanation</w:t>
             </w:r>
@@ -747,27 +719,27 @@
         </w:tc>
         <w:tc>
           <w:tcPr>
-            <w:tcW w:type="dxa" w:w="1900"/>
-            <w:tcBorders>
-              <w:top w:val="single" w:color="8A9BB0" w:sz="4"/>
-              <w:left w:val="single" w:color="8A9BB0" w:sz="4"/>
-              <w:bottom w:val="single" w:color="8A9BB0" w:sz="4"/>
-              <w:right w:val="single" w:color="8A9BB0" w:sz="4"/>
-            </w:tcBorders>
-            <w:tcMar>
-              <w:top w:type="dxa" w:w="60"/>
-              <w:left w:type="dxa" w:w="90"/>
-              <w:bottom w:type="dxa" w:w="60"/>
-              <w:right w:type="dxa" w:w="90"/>
-            </w:tcMar>
-          </w:tcPr>
-          <w:p>
-            <w:r>
-              <w:rPr>
-                <w:b w:val="false"/>
-                <w:bCs w:val="false"/>
-                <w:sz w:val="18"/>
-                <w:szCs w:val="18"/>
+            <w:tcW w:type="dxa" w:w="1208"/>
+            <w:tcBorders>
+              <w:top w:val="single"/>
+              <w:left w:val="single"/>
+              <w:bottom w:val="single"/>
+              <w:right w:val="single"/>
+            </w:tcBorders>
+            <w:tcMar>
+              <w:top w:type="dxa" w:w="60"/>
+              <w:left w:type="dxa" w:w="90"/>
+              <w:bottom w:type="dxa" w:w="60"/>
+              <w:right w:type="dxa" w:w="90"/>
+            </w:tcMar>
+          </w:tcPr>
+          <w:p>
+            <w:r>
+              <w:rPr>
+                <w:b w:val="false"/>
+                <w:bCs w:val="false"/>
+                <w:sz w:val="20"/>
+                <w:szCs w:val="20"/>
               </w:rPr>
               <w:t xml:space="preserve">BlueprintCell or RevisionRequest</w:t>
             </w:r>
@@ -775,27 +747,27 @@
         </w:tc>
         <w:tc>
           <w:tcPr>
-            <w:tcW w:type="dxa" w:w="1900"/>
-            <w:tcBorders>
-              <w:top w:val="single" w:color="8A9BB0" w:sz="4"/>
-              <w:left w:val="single" w:color="8A9BB0" w:sz="4"/>
-              <w:bottom w:val="single" w:color="8A9BB0" w:sz="4"/>
-              <w:right w:val="single" w:color="8A9BB0" w:sz="4"/>
-            </w:tcBorders>
-            <w:tcMar>
-              <w:top w:type="dxa" w:w="60"/>
-              <w:left w:type="dxa" w:w="90"/>
-              <w:bottom w:type="dxa" w:w="60"/>
-              <w:right w:type="dxa" w:w="90"/>
-            </w:tcMar>
-          </w:tcPr>
-          <w:p>
-            <w:r>
-              <w:rPr>
-                <w:b w:val="false"/>
-                <w:bCs w:val="false"/>
-                <w:sz w:val="18"/>
-                <w:szCs w:val="18"/>
+            <w:tcW w:type="dxa" w:w="1350"/>
+            <w:tcBorders>
+              <w:top w:val="single"/>
+              <w:left w:val="single"/>
+              <w:bottom w:val="single"/>
+              <w:right w:val="single"/>
+            </w:tcBorders>
+            <w:tcMar>
+              <w:top w:type="dxa" w:w="60"/>
+              <w:left w:type="dxa" w:w="90"/>
+              <w:bottom w:type="dxa" w:w="60"/>
+              <w:right w:type="dxa" w:w="90"/>
+            </w:tcMar>
+          </w:tcPr>
+          <w:p>
+            <w:r>
+              <w:rPr>
+                <w:b w:val="false"/>
+                <w:bCs w:val="false"/>
+                <w:sz w:val="20"/>
+                <w:szCs w:val="20"/>
               </w:rPr>
               <w:t xml:space="preserve">ItemDraftBatch</w:t>
             </w:r>
@@ -803,27 +775,27 @@
         </w:tc>
         <w:tc>
           <w:tcPr>
-            <w:tcW w:type="dxa" w:w="2300"/>
-            <w:tcBorders>
-              <w:top w:val="single" w:color="8A9BB0" w:sz="4"/>
-              <w:left w:val="single" w:color="8A9BB0" w:sz="4"/>
-              <w:bottom w:val="single" w:color="8A9BB0" w:sz="4"/>
-              <w:right w:val="single" w:color="8A9BB0" w:sz="4"/>
-            </w:tcBorders>
-            <w:tcMar>
-              <w:top w:type="dxa" w:w="60"/>
-              <w:left w:type="dxa" w:w="90"/>
-              <w:bottom w:type="dxa" w:w="60"/>
-              <w:right w:type="dxa" w:w="90"/>
-            </w:tcMar>
-          </w:tcPr>
-          <w:p>
-            <w:r>
-              <w:rPr>
-                <w:b w:val="false"/>
-                <w:bCs w:val="false"/>
-                <w:sz w:val="18"/>
-                <w:szCs w:val="18"/>
+            <w:tcW w:type="dxa" w:w="1777"/>
+            <w:tcBorders>
+              <w:top w:val="single"/>
+              <w:left w:val="single"/>
+              <w:bottom w:val="single"/>
+              <w:right w:val="single"/>
+            </w:tcBorders>
+            <w:tcMar>
+              <w:top w:type="dxa" w:w="60"/>
+              <w:left w:type="dxa" w:w="90"/>
+              <w:bottom w:type="dxa" w:w="60"/>
+              <w:right w:type="dxa" w:w="90"/>
+            </w:tcMar>
+          </w:tcPr>
+          <w:p>
+            <w:r>
+              <w:rPr>
+                <w:b w:val="false"/>
+                <w:bCs w:val="false"/>
+                <w:sz w:val="20"/>
+                <w:szCs w:val="20"/>
               </w:rPr>
               <w:t xml:space="preserve">get_competence_descriptor, get_bank_examples</w:t>
             </w:r>
@@ -831,27 +803,27 @@
         </w:tc>
         <w:tc>
           <w:tcPr>
-            <w:tcW w:type="dxa" w:w="2600"/>
-            <w:tcBorders>
-              <w:top w:val="single" w:color="8A9BB0" w:sz="4"/>
-              <w:left w:val="single" w:color="8A9BB0" w:sz="4"/>
-              <w:bottom w:val="single" w:color="8A9BB0" w:sz="4"/>
-              <w:right w:val="single" w:color="8A9BB0" w:sz="4"/>
-            </w:tcBorders>
-            <w:tcMar>
-              <w:top w:type="dxa" w:w="60"/>
-              <w:left w:type="dxa" w:w="90"/>
-              <w:bottom w:type="dxa" w:w="60"/>
-              <w:right w:type="dxa" w:w="90"/>
-            </w:tcMar>
-          </w:tcPr>
-          <w:p>
-            <w:r>
-              <w:rPr>
-                <w:b w:val="false"/>
-                <w:bCs w:val="false"/>
-                <w:sz w:val="18"/>
-                <w:szCs w:val="18"/>
+            <w:tcW w:type="dxa" w:w="1777"/>
+            <w:tcBorders>
+              <w:top w:val="single"/>
+              <w:left w:val="single"/>
+              <w:bottom w:val="single"/>
+              <w:right w:val="single"/>
+            </w:tcBorders>
+            <w:tcMar>
+              <w:top w:type="dxa" w:w="60"/>
+              <w:left w:type="dxa" w:w="90"/>
+              <w:bottom w:type="dxa" w:w="60"/>
+              <w:right w:type="dxa" w:w="90"/>
+            </w:tcMar>
+          </w:tcPr>
+          <w:p>
+            <w:r>
+              <w:rPr>
+                <w:b w:val="false"/>
+                <w:bCs w:val="false"/>
+                <w:sz w:val="20"/>
+                <w:szCs w:val="20"/>
               </w:rPr>
               <w:t xml:space="preserve">Required number of drafts for the cell is written</w:t>
             </w:r>
@@ -864,12 +836,12 @@
         </w:trPr>
         <w:tc>
           <w:tcPr>
-            <w:tcW w:type="dxa" w:w="1700"/>
-            <w:tcBorders>
-              <w:top w:val="single" w:color="8A9BB0" w:sz="4"/>
-              <w:left w:val="single" w:color="8A9BB0" w:sz="4"/>
-              <w:bottom w:val="single" w:color="8A9BB0" w:sz="4"/>
-              <w:right w:val="single" w:color="8A9BB0" w:sz="4"/>
+            <w:tcW w:type="dxa" w:w="1350"/>
+            <w:tcBorders>
+              <w:top w:val="single"/>
+              <w:left w:val="single"/>
+              <w:bottom w:val="single"/>
+              <w:right w:val="single"/>
             </w:tcBorders>
             <w:tcMar>
               <w:top w:type="dxa" w:w="60"/>
@@ -883,8 +855,8 @@
               <w:rPr>
                 <w:b/>
                 <w:bCs/>
-                <w:sz w:val="18"/>
-                <w:szCs w:val="18"/>
+                <w:sz w:val="20"/>
+                <w:szCs w:val="20"/>
               </w:rPr>
               <w:t xml:space="preserve">Distractor Designer</w:t>
             </w:r>
@@ -892,27 +864,27 @@
         </w:tc>
         <w:tc>
           <w:tcPr>
-            <w:tcW w:type="dxa" w:w="2300"/>
-            <w:tcBorders>
-              <w:top w:val="single" w:color="8A9BB0" w:sz="4"/>
-              <w:left w:val="single" w:color="8A9BB0" w:sz="4"/>
-              <w:bottom w:val="single" w:color="8A9BB0" w:sz="4"/>
-              <w:right w:val="single" w:color="8A9BB0" w:sz="4"/>
-            </w:tcBorders>
-            <w:tcMar>
-              <w:top w:type="dxa" w:w="60"/>
-              <w:left w:type="dxa" w:w="90"/>
-              <w:bottom w:type="dxa" w:w="60"/>
-              <w:right w:type="dxa" w:w="90"/>
-            </w:tcMar>
-          </w:tcPr>
-          <w:p>
-            <w:r>
-              <w:rPr>
-                <w:b w:val="false"/>
-                <w:bCs w:val="false"/>
-                <w:sz w:val="18"/>
-                <w:szCs w:val="18"/>
+            <w:tcW w:type="dxa" w:w="1564"/>
+            <w:tcBorders>
+              <w:top w:val="single"/>
+              <w:left w:val="single"/>
+              <w:bottom w:val="single"/>
+              <w:right w:val="single"/>
+            </w:tcBorders>
+            <w:tcMar>
+              <w:top w:type="dxa" w:w="60"/>
+              <w:left w:type="dxa" w:w="90"/>
+              <w:bottom w:type="dxa" w:w="60"/>
+              <w:right w:type="dxa" w:w="90"/>
+            </w:tcMar>
+          </w:tcPr>
+          <w:p>
+            <w:r>
+              <w:rPr>
+                <w:b w:val="false"/>
+                <w:bCs w:val="false"/>
+                <w:sz w:val="20"/>
+                <w:szCs w:val="20"/>
               </w:rPr>
               <w:t xml:space="preserve">Adds plausible wrong options and feedback for each option</w:t>
             </w:r>
@@ -920,27 +892,27 @@
         </w:tc>
         <w:tc>
           <w:tcPr>
-            <w:tcW w:type="dxa" w:w="1900"/>
-            <w:tcBorders>
-              <w:top w:val="single" w:color="8A9BB0" w:sz="4"/>
-              <w:left w:val="single" w:color="8A9BB0" w:sz="4"/>
-              <w:bottom w:val="single" w:color="8A9BB0" w:sz="4"/>
-              <w:right w:val="single" w:color="8A9BB0" w:sz="4"/>
-            </w:tcBorders>
-            <w:tcMar>
-              <w:top w:type="dxa" w:w="60"/>
-              <w:left w:type="dxa" w:w="90"/>
-              <w:bottom w:type="dxa" w:w="60"/>
-              <w:right w:type="dxa" w:w="90"/>
-            </w:tcMar>
-          </w:tcPr>
-          <w:p>
-            <w:r>
-              <w:rPr>
-                <w:b w:val="false"/>
-                <w:bCs w:val="false"/>
-                <w:sz w:val="18"/>
-                <w:szCs w:val="18"/>
+            <w:tcW w:type="dxa" w:w="1208"/>
+            <w:tcBorders>
+              <w:top w:val="single"/>
+              <w:left w:val="single"/>
+              <w:bottom w:val="single"/>
+              <w:right w:val="single"/>
+            </w:tcBorders>
+            <w:tcMar>
+              <w:top w:type="dxa" w:w="60"/>
+              <w:left w:type="dxa" w:w="90"/>
+              <w:bottom w:type="dxa" w:w="60"/>
+              <w:right w:type="dxa" w:w="90"/>
+            </w:tcMar>
+          </w:tcPr>
+          <w:p>
+            <w:r>
+              <w:rPr>
+                <w:b w:val="false"/>
+                <w:bCs w:val="false"/>
+                <w:sz w:val="20"/>
+                <w:szCs w:val="20"/>
               </w:rPr>
               <w:t xml:space="preserve">ItemDraftBatch</w:t>
             </w:r>
@@ -948,27 +920,27 @@
         </w:tc>
         <w:tc>
           <w:tcPr>
-            <w:tcW w:type="dxa" w:w="1900"/>
-            <w:tcBorders>
-              <w:top w:val="single" w:color="8A9BB0" w:sz="4"/>
-              <w:left w:val="single" w:color="8A9BB0" w:sz="4"/>
-              <w:bottom w:val="single" w:color="8A9BB0" w:sz="4"/>
-              <w:right w:val="single" w:color="8A9BB0" w:sz="4"/>
-            </w:tcBorders>
-            <w:tcMar>
-              <w:top w:type="dxa" w:w="60"/>
-              <w:left w:type="dxa" w:w="90"/>
-              <w:bottom w:type="dxa" w:w="60"/>
-              <w:right w:type="dxa" w:w="90"/>
-            </w:tcMar>
-          </w:tcPr>
-          <w:p>
-            <w:r>
-              <w:rPr>
-                <w:b w:val="false"/>
-                <w:bCs w:val="false"/>
-                <w:sz w:val="18"/>
-                <w:szCs w:val="18"/>
+            <w:tcW w:type="dxa" w:w="1350"/>
+            <w:tcBorders>
+              <w:top w:val="single"/>
+              <w:left w:val="single"/>
+              <w:bottom w:val="single"/>
+              <w:right w:val="single"/>
+            </w:tcBorders>
+            <w:tcMar>
+              <w:top w:type="dxa" w:w="60"/>
+              <w:left w:type="dxa" w:w="90"/>
+              <w:bottom w:type="dxa" w:w="60"/>
+              <w:right w:type="dxa" w:w="90"/>
+            </w:tcMar>
+          </w:tcPr>
+          <w:p>
+            <w:r>
+              <w:rPr>
+                <w:b w:val="false"/>
+                <w:bCs w:val="false"/>
+                <w:sz w:val="20"/>
+                <w:szCs w:val="20"/>
               </w:rPr>
               <w:t xml:space="preserve">ItemBatch</w:t>
             </w:r>
@@ -976,27 +948,27 @@
         </w:tc>
         <w:tc>
           <w:tcPr>
-            <w:tcW w:type="dxa" w:w="2300"/>
-            <w:tcBorders>
-              <w:top w:val="single" w:color="8A9BB0" w:sz="4"/>
-              <w:left w:val="single" w:color="8A9BB0" w:sz="4"/>
-              <w:bottom w:val="single" w:color="8A9BB0" w:sz="4"/>
-              <w:right w:val="single" w:color="8A9BB0" w:sz="4"/>
-            </w:tcBorders>
-            <w:tcMar>
-              <w:top w:type="dxa" w:w="60"/>
-              <w:left w:type="dxa" w:w="90"/>
-              <w:bottom w:type="dxa" w:w="60"/>
-              <w:right w:type="dxa" w:w="90"/>
-            </w:tcMar>
-          </w:tcPr>
-          <w:p>
-            <w:r>
-              <w:rPr>
-                <w:b w:val="false"/>
-                <w:bCs w:val="false"/>
-                <w:sz w:val="18"/>
-                <w:szCs w:val="18"/>
+            <w:tcW w:type="dxa" w:w="1777"/>
+            <w:tcBorders>
+              <w:top w:val="single"/>
+              <w:left w:val="single"/>
+              <w:bottom w:val="single"/>
+              <w:right w:val="single"/>
+            </w:tcBorders>
+            <w:tcMar>
+              <w:top w:type="dxa" w:w="60"/>
+              <w:left w:type="dxa" w:w="90"/>
+              <w:bottom w:type="dxa" w:w="60"/>
+              <w:right w:type="dxa" w:w="90"/>
+            </w:tcMar>
+          </w:tcPr>
+          <w:p>
+            <w:r>
+              <w:rPr>
+                <w:b w:val="false"/>
+                <w:bCs w:val="false"/>
+                <w:sz w:val="20"/>
+                <w:szCs w:val="20"/>
               </w:rPr>
               <w:t xml:space="preserve">get_misconceptions</w:t>
             </w:r>
@@ -1004,27 +976,27 @@
         </w:tc>
         <w:tc>
           <w:tcPr>
-            <w:tcW w:type="dxa" w:w="2600"/>
-            <w:tcBorders>
-              <w:top w:val="single" w:color="8A9BB0" w:sz="4"/>
-              <w:left w:val="single" w:color="8A9BB0" w:sz="4"/>
-              <w:bottom w:val="single" w:color="8A9BB0" w:sz="4"/>
-              <w:right w:val="single" w:color="8A9BB0" w:sz="4"/>
-            </w:tcBorders>
-            <w:tcMar>
-              <w:top w:type="dxa" w:w="60"/>
-              <w:left w:type="dxa" w:w="90"/>
-              <w:bottom w:type="dxa" w:w="60"/>
-              <w:right w:type="dxa" w:w="90"/>
-            </w:tcMar>
-          </w:tcPr>
-          <w:p>
-            <w:r>
-              <w:rPr>
-                <w:b w:val="false"/>
-                <w:bCs w:val="false"/>
-                <w:sz w:val="18"/>
-                <w:szCs w:val="18"/>
+            <w:tcW w:type="dxa" w:w="1777"/>
+            <w:tcBorders>
+              <w:top w:val="single"/>
+              <w:left w:val="single"/>
+              <w:bottom w:val="single"/>
+              <w:right w:val="single"/>
+            </w:tcBorders>
+            <w:tcMar>
+              <w:top w:type="dxa" w:w="60"/>
+              <w:left w:type="dxa" w:w="90"/>
+              <w:bottom w:type="dxa" w:w="60"/>
+              <w:right w:type="dxa" w:w="90"/>
+            </w:tcMar>
+          </w:tcPr>
+          <w:p>
+            <w:r>
+              <w:rPr>
+                <w:b w:val="false"/>
+                <w:bCs w:val="false"/>
+                <w:sz w:val="20"/>
+                <w:szCs w:val="20"/>
               </w:rPr>
               <w:t xml:space="preserve">Every item has full options with feedback</w:t>
             </w:r>
@@ -1037,12 +1009,12 @@
         </w:trPr>
         <w:tc>
           <w:tcPr>
-            <w:tcW w:type="dxa" w:w="1700"/>
-            <w:tcBorders>
-              <w:top w:val="single" w:color="8A9BB0" w:sz="4"/>
-              <w:left w:val="single" w:color="8A9BB0" w:sz="4"/>
-              <w:bottom w:val="single" w:color="8A9BB0" w:sz="4"/>
-              <w:right w:val="single" w:color="8A9BB0" w:sz="4"/>
+            <w:tcW w:type="dxa" w:w="1350"/>
+            <w:tcBorders>
+              <w:top w:val="single"/>
+              <w:left w:val="single"/>
+              <w:bottom w:val="single"/>
+              <w:right w:val="single"/>
             </w:tcBorders>
             <w:tcMar>
               <w:top w:type="dxa" w:w="60"/>
@@ -1056,8 +1028,8 @@
               <w:rPr>
                 <w:b/>
                 <w:bCs/>
-                <w:sz w:val="18"/>
-                <w:szCs w:val="18"/>
+                <w:sz w:val="20"/>
+                <w:szCs w:val="20"/>
               </w:rPr>
               <w:t xml:space="preserve">Alignment Reviewer</w:t>
             </w:r>
@@ -1065,27 +1037,27 @@
         </w:tc>
         <w:tc>
           <w:tcPr>
-            <w:tcW w:type="dxa" w:w="2300"/>
-            <w:tcBorders>
-              <w:top w:val="single" w:color="8A9BB0" w:sz="4"/>
-              <w:left w:val="single" w:color="8A9BB0" w:sz="4"/>
-              <w:bottom w:val="single" w:color="8A9BB0" w:sz="4"/>
-              <w:right w:val="single" w:color="8A9BB0" w:sz="4"/>
-            </w:tcBorders>
-            <w:tcMar>
-              <w:top w:type="dxa" w:w="60"/>
-              <w:left w:type="dxa" w:w="90"/>
-              <w:bottom w:type="dxa" w:w="60"/>
-              <w:right w:type="dxa" w:w="90"/>
-            </w:tcMar>
-          </w:tcPr>
-          <w:p>
-            <w:r>
-              <w:rPr>
-                <w:b w:val="false"/>
-                <w:bCs w:val="false"/>
-                <w:sz w:val="18"/>
-                <w:szCs w:val="18"/>
+            <w:tcW w:type="dxa" w:w="1564"/>
+            <w:tcBorders>
+              <w:top w:val="single"/>
+              <w:left w:val="single"/>
+              <w:bottom w:val="single"/>
+              <w:right w:val="single"/>
+            </w:tcBorders>
+            <w:tcMar>
+              <w:top w:type="dxa" w:w="60"/>
+              <w:left w:type="dxa" w:w="90"/>
+              <w:bottom w:type="dxa" w:w="60"/>
+              <w:right w:type="dxa" w:w="90"/>
+            </w:tcMar>
+          </w:tcPr>
+          <w:p>
+            <w:r>
+              <w:rPr>
+                <w:b w:val="false"/>
+                <w:bCs w:val="false"/>
+                <w:sz w:val="20"/>
+                <w:szCs w:val="20"/>
               </w:rPr>
               <w:t xml:space="preserve">Methodologist: checks competence and level match; item must not be solvable by general skills only</w:t>
             </w:r>
@@ -1093,27 +1065,27 @@
         </w:tc>
         <w:tc>
           <w:tcPr>
-            <w:tcW w:type="dxa" w:w="1900"/>
-            <w:tcBorders>
-              <w:top w:val="single" w:color="8A9BB0" w:sz="4"/>
-              <w:left w:val="single" w:color="8A9BB0" w:sz="4"/>
-              <w:bottom w:val="single" w:color="8A9BB0" w:sz="4"/>
-              <w:right w:val="single" w:color="8A9BB0" w:sz="4"/>
-            </w:tcBorders>
-            <w:tcMar>
-              <w:top w:type="dxa" w:w="60"/>
-              <w:left w:type="dxa" w:w="90"/>
-              <w:bottom w:type="dxa" w:w="60"/>
-              <w:right w:type="dxa" w:w="90"/>
-            </w:tcMar>
-          </w:tcPr>
-          <w:p>
-            <w:r>
-              <w:rPr>
-                <w:b w:val="false"/>
-                <w:bCs w:val="false"/>
-                <w:sz w:val="18"/>
-                <w:szCs w:val="18"/>
+            <w:tcW w:type="dxa" w:w="1208"/>
+            <w:tcBorders>
+              <w:top w:val="single"/>
+              <w:left w:val="single"/>
+              <w:bottom w:val="single"/>
+              <w:right w:val="single"/>
+            </w:tcBorders>
+            <w:tcMar>
+              <w:top w:type="dxa" w:w="60"/>
+              <w:left w:type="dxa" w:w="90"/>
+              <w:bottom w:type="dxa" w:w="60"/>
+              <w:right w:type="dxa" w:w="90"/>
+            </w:tcMar>
+          </w:tcPr>
+          <w:p>
+            <w:r>
+              <w:rPr>
+                <w:b w:val="false"/>
+                <w:bCs w:val="false"/>
+                <w:sz w:val="20"/>
+                <w:szCs w:val="20"/>
               </w:rPr>
               <w:t xml:space="preserve">ItemBatch (sees the key)</w:t>
             </w:r>
@@ -1121,27 +1093,27 @@
         </w:tc>
         <w:tc>
           <w:tcPr>
-            <w:tcW w:type="dxa" w:w="1900"/>
-            <w:tcBorders>
-              <w:top w:val="single" w:color="8A9BB0" w:sz="4"/>
-              <w:left w:val="single" w:color="8A9BB0" w:sz="4"/>
-              <w:bottom w:val="single" w:color="8A9BB0" w:sz="4"/>
-              <w:right w:val="single" w:color="8A9BB0" w:sz="4"/>
-            </w:tcBorders>
-            <w:tcMar>
-              <w:top w:type="dxa" w:w="60"/>
-              <w:left w:type="dxa" w:w="90"/>
-              <w:bottom w:type="dxa" w:w="60"/>
-              <w:right w:type="dxa" w:w="90"/>
-            </w:tcMar>
-          </w:tcPr>
-          <w:p>
-            <w:r>
-              <w:rPr>
-                <w:b w:val="false"/>
-                <w:bCs w:val="false"/>
-                <w:sz w:val="18"/>
-                <w:szCs w:val="18"/>
+            <w:tcW w:type="dxa" w:w="1350"/>
+            <w:tcBorders>
+              <w:top w:val="single"/>
+              <w:left w:val="single"/>
+              <w:bottom w:val="single"/>
+              <w:right w:val="single"/>
+            </w:tcBorders>
+            <w:tcMar>
+              <w:top w:type="dxa" w:w="60"/>
+              <w:left w:type="dxa" w:w="90"/>
+              <w:bottom w:type="dxa" w:w="60"/>
+              <w:right w:type="dxa" w:w="90"/>
+            </w:tcMar>
+          </w:tcPr>
+          <w:p>
+            <w:r>
+              <w:rPr>
+                <w:b w:val="false"/>
+                <w:bCs w:val="false"/>
+                <w:sz w:val="20"/>
+                <w:szCs w:val="20"/>
               </w:rPr>
               <w:t xml:space="preserve">AlignmentBatch (competence_match, level_match, requires_competence, solvable_by, issues); code decides accept or revise</w:t>
             </w:r>
@@ -1149,27 +1121,27 @@
         </w:tc>
         <w:tc>
           <w:tcPr>
-            <w:tcW w:type="dxa" w:w="2300"/>
-            <w:tcBorders>
-              <w:top w:val="single" w:color="8A9BB0" w:sz="4"/>
-              <w:left w:val="single" w:color="8A9BB0" w:sz="4"/>
-              <w:bottom w:val="single" w:color="8A9BB0" w:sz="4"/>
-              <w:right w:val="single" w:color="8A9BB0" w:sz="4"/>
-            </w:tcBorders>
-            <w:tcMar>
-              <w:top w:type="dxa" w:w="60"/>
-              <w:left w:type="dxa" w:w="90"/>
-              <w:bottom w:type="dxa" w:w="60"/>
-              <w:right w:type="dxa" w:w="90"/>
-            </w:tcMar>
-          </w:tcPr>
-          <w:p>
-            <w:r>
-              <w:rPr>
-                <w:b w:val="false"/>
-                <w:bCs w:val="false"/>
-                <w:sz w:val="18"/>
-                <w:szCs w:val="18"/>
+            <w:tcW w:type="dxa" w:w="1777"/>
+            <w:tcBorders>
+              <w:top w:val="single"/>
+              <w:left w:val="single"/>
+              <w:bottom w:val="single"/>
+              <w:right w:val="single"/>
+            </w:tcBorders>
+            <w:tcMar>
+              <w:top w:type="dxa" w:w="60"/>
+              <w:left w:type="dxa" w:w="90"/>
+              <w:bottom w:type="dxa" w:w="60"/>
+              <w:right w:type="dxa" w:w="90"/>
+            </w:tcMar>
+          </w:tcPr>
+          <w:p>
+            <w:r>
+              <w:rPr>
+                <w:b w:val="false"/>
+                <w:bCs w:val="false"/>
+                <w:sz w:val="20"/>
+                <w:szCs w:val="20"/>
               </w:rPr>
               <w:t xml:space="preserve">get_competence_descriptor</w:t>
             </w:r>
@@ -1177,27 +1149,27 @@
         </w:tc>
         <w:tc>
           <w:tcPr>
-            <w:tcW w:type="dxa" w:w="2600"/>
-            <w:tcBorders>
-              <w:top w:val="single" w:color="8A9BB0" w:sz="4"/>
-              <w:left w:val="single" w:color="8A9BB0" w:sz="4"/>
-              <w:bottom w:val="single" w:color="8A9BB0" w:sz="4"/>
-              <w:right w:val="single" w:color="8A9BB0" w:sz="4"/>
-            </w:tcBorders>
-            <w:tcMar>
-              <w:top w:type="dxa" w:w="60"/>
-              <w:left w:type="dxa" w:w="90"/>
-              <w:bottom w:type="dxa" w:w="60"/>
-              <w:right w:type="dxa" w:w="90"/>
-            </w:tcMar>
-          </w:tcPr>
-          <w:p>
-            <w:r>
-              <w:rPr>
-                <w:b w:val="false"/>
-                <w:bCs w:val="false"/>
-                <w:sz w:val="18"/>
-                <w:szCs w:val="18"/>
+            <w:tcW w:type="dxa" w:w="1777"/>
+            <w:tcBorders>
+              <w:top w:val="single"/>
+              <w:left w:val="single"/>
+              <w:bottom w:val="single"/>
+              <w:right w:val="single"/>
+            </w:tcBorders>
+            <w:tcMar>
+              <w:top w:type="dxa" w:w="60"/>
+              <w:left w:type="dxa" w:w="90"/>
+              <w:bottom w:type="dxa" w:w="60"/>
+              <w:right w:type="dxa" w:w="90"/>
+            </w:tcMar>
+          </w:tcPr>
+          <w:p>
+            <w:r>
+              <w:rPr>
+                <w:b w:val="false"/>
+                <w:bCs w:val="false"/>
+                <w:sz w:val="20"/>
+                <w:szCs w:val="20"/>
               </w:rPr>
               <w:t xml:space="preserve">Every item has a verdict; accepted items move on</w:t>
             </w:r>
@@ -1210,12 +1182,12 @@
         </w:trPr>
         <w:tc>
           <w:tcPr>
-            <w:tcW w:type="dxa" w:w="1700"/>
-            <w:tcBorders>
-              <w:top w:val="single" w:color="8A9BB0" w:sz="4"/>
-              <w:left w:val="single" w:color="8A9BB0" w:sz="4"/>
-              <w:bottom w:val="single" w:color="8A9BB0" w:sz="4"/>
-              <w:right w:val="single" w:color="8A9BB0" w:sz="4"/>
+            <w:tcW w:type="dxa" w:w="1350"/>
+            <w:tcBorders>
+              <w:top w:val="single"/>
+              <w:left w:val="single"/>
+              <w:bottom w:val="single"/>
+              <w:right w:val="single"/>
             </w:tcBorders>
             <w:tcMar>
               <w:top w:type="dxa" w:w="60"/>
@@ -1229,8 +1201,8 @@
               <w:rPr>
                 <w:b/>
                 <w:bCs/>
-                <w:sz w:val="18"/>
-                <w:szCs w:val="18"/>
+                <w:sz w:val="20"/>
+                <w:szCs w:val="20"/>
               </w:rPr>
               <w:t xml:space="preserve">Quality Verifier</w:t>
             </w:r>
@@ -1238,27 +1210,27 @@
         </w:tc>
         <w:tc>
           <w:tcPr>
-            <w:tcW w:type="dxa" w:w="2300"/>
-            <w:tcBorders>
-              <w:top w:val="single" w:color="8A9BB0" w:sz="4"/>
-              <w:left w:val="single" w:color="8A9BB0" w:sz="4"/>
-              <w:bottom w:val="single" w:color="8A9BB0" w:sz="4"/>
-              <w:right w:val="single" w:color="8A9BB0" w:sz="4"/>
-            </w:tcBorders>
-            <w:tcMar>
-              <w:top w:type="dxa" w:w="60"/>
-              <w:left w:type="dxa" w:w="90"/>
-              <w:bottom w:type="dxa" w:w="60"/>
-              <w:right w:type="dxa" w:w="90"/>
-            </w:tcMar>
-          </w:tcPr>
-          <w:p>
-            <w:r>
-              <w:rPr>
-                <w:b w:val="false"/>
-                <w:bCs w:val="false"/>
-                <w:sz w:val="18"/>
-                <w:szCs w:val="18"/>
+            <w:tcW w:type="dxa" w:w="1564"/>
+            <w:tcBorders>
+              <w:top w:val="single"/>
+              <w:left w:val="single"/>
+              <w:bottom w:val="single"/>
+              <w:right w:val="single"/>
+            </w:tcBorders>
+            <w:tcMar>
+              <w:top w:type="dxa" w:w="60"/>
+              <w:left w:type="dxa" w:w="90"/>
+              <w:bottom w:type="dxa" w:w="60"/>
+              <w:right w:type="dxa" w:w="90"/>
+            </w:tcMar>
+          </w:tcPr>
+          <w:p>
+            <w:r>
+              <w:rPr>
+                <w:b w:val="false"/>
+                <w:bCs w:val="false"/>
+                <w:sz w:val="20"/>
+                <w:szCs w:val="20"/>
               </w:rPr>
               <w:t xml:space="preserve">Test expert: solves blind, looks for a second defensible answer, recomputes numbers, finds duplicates</w:t>
             </w:r>
@@ -1266,27 +1238,27 @@
         </w:tc>
         <w:tc>
           <w:tcPr>
-            <w:tcW w:type="dxa" w:w="1900"/>
-            <w:tcBorders>
-              <w:top w:val="single" w:color="8A9BB0" w:sz="4"/>
-              <w:left w:val="single" w:color="8A9BB0" w:sz="4"/>
-              <w:bottom w:val="single" w:color="8A9BB0" w:sz="4"/>
-              <w:right w:val="single" w:color="8A9BB0" w:sz="4"/>
-            </w:tcBorders>
-            <w:tcMar>
-              <w:top w:type="dxa" w:w="60"/>
-              <w:left w:type="dxa" w:w="90"/>
-              <w:bottom w:type="dxa" w:w="60"/>
-              <w:right w:type="dxa" w:w="90"/>
-            </w:tcMar>
-          </w:tcPr>
-          <w:p>
-            <w:r>
-              <w:rPr>
-                <w:b w:val="false"/>
-                <w:bCs w:val="false"/>
-                <w:sz w:val="18"/>
-                <w:szCs w:val="18"/>
+            <w:tcW w:type="dxa" w:w="1208"/>
+            <w:tcBorders>
+              <w:top w:val="single"/>
+              <w:left w:val="single"/>
+              <w:bottom w:val="single"/>
+              <w:right w:val="single"/>
+            </w:tcBorders>
+            <w:tcMar>
+              <w:top w:type="dxa" w:w="60"/>
+              <w:left w:type="dxa" w:w="90"/>
+              <w:bottom w:type="dxa" w:w="60"/>
+              <w:right w:type="dxa" w:w="90"/>
+            </w:tcMar>
+          </w:tcPr>
+          <w:p>
+            <w:r>
+              <w:rPr>
+                <w:b w:val="false"/>
+                <w:bCs w:val="false"/>
+                <w:sz w:val="20"/>
+                <w:szCs w:val="20"/>
               </w:rPr>
               <w:t xml:space="preserve">ItemBatch (blind view, no key)</w:t>
             </w:r>
@@ -1294,27 +1266,27 @@
         </w:tc>
         <w:tc>
           <w:tcPr>
-            <w:tcW w:type="dxa" w:w="1900"/>
-            <w:tcBorders>
-              <w:top w:val="single" w:color="8A9BB0" w:sz="4"/>
-              <w:left w:val="single" w:color="8A9BB0" w:sz="4"/>
-              <w:bottom w:val="single" w:color="8A9BB0" w:sz="4"/>
-              <w:right w:val="single" w:color="8A9BB0" w:sz="4"/>
-            </w:tcBorders>
-            <w:tcMar>
-              <w:top w:type="dxa" w:w="60"/>
-              <w:left w:type="dxa" w:w="90"/>
-              <w:bottom w:type="dxa" w:w="60"/>
-              <w:right w:type="dxa" w:w="90"/>
-            </w:tcMar>
-          </w:tcPr>
-          <w:p>
-            <w:r>
-              <w:rPr>
-                <w:b w:val="false"/>
-                <w:bCs w:val="false"/>
-                <w:sz w:val="18"/>
-                <w:szCs w:val="18"/>
+            <w:tcW w:type="dxa" w:w="1350"/>
+            <w:tcBorders>
+              <w:top w:val="single"/>
+              <w:left w:val="single"/>
+              <w:bottom w:val="single"/>
+              <w:right w:val="single"/>
+            </w:tcBorders>
+            <w:tcMar>
+              <w:top w:type="dxa" w:w="60"/>
+              <w:left w:type="dxa" w:w="90"/>
+              <w:bottom w:type="dxa" w:w="60"/>
+              <w:right w:type="dxa" w:w="90"/>
+            </w:tcMar>
+          </w:tcPr>
+          <w:p>
+            <w:r>
+              <w:rPr>
+                <w:b w:val="false"/>
+                <w:bCs w:val="false"/>
+                <w:sz w:val="20"/>
+                <w:szCs w:val="20"/>
               </w:rPr>
               <w:t xml:space="preserve">VerdictBatch or RevisionRequest</w:t>
             </w:r>
@@ -1322,27 +1294,27 @@
         </w:tc>
         <w:tc>
           <w:tcPr>
-            <w:tcW w:type="dxa" w:w="2300"/>
-            <w:tcBorders>
-              <w:top w:val="single" w:color="8A9BB0" w:sz="4"/>
-              <w:left w:val="single" w:color="8A9BB0" w:sz="4"/>
-              <w:bottom w:val="single" w:color="8A9BB0" w:sz="4"/>
-              <w:right w:val="single" w:color="8A9BB0" w:sz="4"/>
-            </w:tcBorders>
-            <w:tcMar>
-              <w:top w:type="dxa" w:w="60"/>
-              <w:left w:type="dxa" w:w="90"/>
-              <w:bottom w:type="dxa" w:w="60"/>
-              <w:right w:type="dxa" w:w="90"/>
-            </w:tcMar>
-          </w:tcPr>
-          <w:p>
-            <w:r>
-              <w:rPr>
-                <w:b w:val="false"/>
-                <w:bCs w:val="false"/>
-                <w:sz w:val="18"/>
-                <w:szCs w:val="18"/>
+            <w:tcW w:type="dxa" w:w="1777"/>
+            <w:tcBorders>
+              <w:top w:val="single"/>
+              <w:left w:val="single"/>
+              <w:bottom w:val="single"/>
+              <w:right w:val="single"/>
+            </w:tcBorders>
+            <w:tcMar>
+              <w:top w:type="dxa" w:w="60"/>
+              <w:left w:type="dxa" w:w="90"/>
+              <w:bottom w:type="dxa" w:w="60"/>
+              <w:right w:type="dxa" w:w="90"/>
+            </w:tcMar>
+          </w:tcPr>
+          <w:p>
+            <w:r>
+              <w:rPr>
+                <w:b w:val="false"/>
+                <w:bCs w:val="false"/>
+                <w:sz w:val="20"/>
+                <w:szCs w:val="20"/>
               </w:rPr>
               <w:t xml:space="preserve">similarity_search, run_python</w:t>
             </w:r>
@@ -1350,27 +1322,27 @@
         </w:tc>
         <w:tc>
           <w:tcPr>
-            <w:tcW w:type="dxa" w:w="2600"/>
-            <w:tcBorders>
-              <w:top w:val="single" w:color="8A9BB0" w:sz="4"/>
-              <w:left w:val="single" w:color="8A9BB0" w:sz="4"/>
-              <w:bottom w:val="single" w:color="8A9BB0" w:sz="4"/>
-              <w:right w:val="single" w:color="8A9BB0" w:sz="4"/>
-            </w:tcBorders>
-            <w:tcMar>
-              <w:top w:type="dxa" w:w="60"/>
-              <w:left w:type="dxa" w:w="90"/>
-              <w:bottom w:type="dxa" w:w="60"/>
-              <w:right w:type="dxa" w:w="90"/>
-            </w:tcMar>
-          </w:tcPr>
-          <w:p>
-            <w:r>
-              <w:rPr>
-                <w:b w:val="false"/>
-                <w:bCs w:val="false"/>
-                <w:sz w:val="18"/>
-                <w:szCs w:val="18"/>
+            <w:tcW w:type="dxa" w:w="1777"/>
+            <w:tcBorders>
+              <w:top w:val="single"/>
+              <w:left w:val="single"/>
+              <w:bottom w:val="single"/>
+              <w:right w:val="single"/>
+            </w:tcBorders>
+            <w:tcMar>
+              <w:top w:type="dxa" w:w="60"/>
+              <w:left w:type="dxa" w:w="90"/>
+              <w:bottom w:type="dxa" w:w="60"/>
+              <w:right w:type="dxa" w:w="90"/>
+            </w:tcMar>
+          </w:tcPr>
+          <w:p>
+            <w:r>
+              <w:rPr>
+                <w:b w:val="false"/>
+                <w:bCs w:val="false"/>
+                <w:sz w:val="20"/>
+                <w:szCs w:val="20"/>
               </w:rPr>
               <w:t xml:space="preserve">Every item is accepted, revised, or rejected</w:t>
             </w:r>
@@ -1383,12 +1355,12 @@
         </w:trPr>
         <w:tc>
           <w:tcPr>
-            <w:tcW w:type="dxa" w:w="1700"/>
-            <w:tcBorders>
-              <w:top w:val="single" w:color="8A9BB0" w:sz="4"/>
-              <w:left w:val="single" w:color="8A9BB0" w:sz="4"/>
-              <w:bottom w:val="single" w:color="8A9BB0" w:sz="4"/>
-              <w:right w:val="single" w:color="8A9BB0" w:sz="4"/>
+            <w:tcW w:type="dxa" w:w="1350"/>
+            <w:tcBorders>
+              <w:top w:val="single"/>
+              <w:left w:val="single"/>
+              <w:bottom w:val="single"/>
+              <w:right w:val="single"/>
             </w:tcBorders>
             <w:tcMar>
               <w:top w:type="dxa" w:w="60"/>
@@ -1402,8 +1374,8 @@
               <w:rPr>
                 <w:b/>
                 <w:bCs/>
-                <w:sz w:val="18"/>
-                <w:szCs w:val="18"/>
+                <w:sz w:val="20"/>
+                <w:szCs w:val="20"/>
               </w:rPr>
               <w:t xml:space="preserve">Orchestrator (code)</w:t>
             </w:r>
@@ -1411,27 +1383,27 @@
         </w:tc>
         <w:tc>
           <w:tcPr>
-            <w:tcW w:type="dxa" w:w="2300"/>
-            <w:tcBorders>
-              <w:top w:val="single" w:color="8A9BB0" w:sz="4"/>
-              <w:left w:val="single" w:color="8A9BB0" w:sz="4"/>
-              <w:bottom w:val="single" w:color="8A9BB0" w:sz="4"/>
-              <w:right w:val="single" w:color="8A9BB0" w:sz="4"/>
-            </w:tcBorders>
-            <w:tcMar>
-              <w:top w:type="dxa" w:w="60"/>
-              <w:left w:type="dxa" w:w="90"/>
-              <w:bottom w:type="dxa" w:w="60"/>
-              <w:right w:type="dxa" w:w="90"/>
-            </w:tcMar>
-          </w:tcPr>
-          <w:p>
-            <w:r>
-              <w:rPr>
-                <w:b w:val="false"/>
-                <w:bCs w:val="false"/>
-                <w:sz w:val="18"/>
-                <w:szCs w:val="18"/>
+            <w:tcW w:type="dxa" w:w="1564"/>
+            <w:tcBorders>
+              <w:top w:val="single"/>
+              <w:left w:val="single"/>
+              <w:bottom w:val="single"/>
+              <w:right w:val="single"/>
+            </w:tcBorders>
+            <w:tcMar>
+              <w:top w:type="dxa" w:w="60"/>
+              <w:left w:type="dxa" w:w="90"/>
+              <w:bottom w:type="dxa" w:w="60"/>
+              <w:right w:type="dxa" w:w="90"/>
+            </w:tcMar>
+          </w:tcPr>
+          <w:p>
+            <w:r>
+              <w:rPr>
+                <w:b w:val="false"/>
+                <w:bCs w:val="false"/>
+                <w:sz w:val="20"/>
+                <w:szCs w:val="20"/>
               </w:rPr>
               <w:t xml:space="preserve">Routes messages, runs cells in parallel, applies limits, stores state</w:t>
             </w:r>
@@ -1439,27 +1411,27 @@
         </w:tc>
         <w:tc>
           <w:tcPr>
-            <w:tcW w:type="dxa" w:w="1900"/>
-            <w:tcBorders>
-              <w:top w:val="single" w:color="8A9BB0" w:sz="4"/>
-              <w:left w:val="single" w:color="8A9BB0" w:sz="4"/>
-              <w:bottom w:val="single" w:color="8A9BB0" w:sz="4"/>
-              <w:right w:val="single" w:color="8A9BB0" w:sz="4"/>
-            </w:tcBorders>
-            <w:tcMar>
-              <w:top w:type="dxa" w:w="60"/>
-              <w:left w:type="dxa" w:w="90"/>
-              <w:bottom w:type="dxa" w:w="60"/>
-              <w:right w:type="dxa" w:w="90"/>
-            </w:tcMar>
-          </w:tcPr>
-          <w:p>
-            <w:r>
-              <w:rPr>
-                <w:b w:val="false"/>
-                <w:bCs w:val="false"/>
-                <w:sz w:val="18"/>
-                <w:szCs w:val="18"/>
+            <w:tcW w:type="dxa" w:w="1208"/>
+            <w:tcBorders>
+              <w:top w:val="single"/>
+              <w:left w:val="single"/>
+              <w:bottom w:val="single"/>
+              <w:right w:val="single"/>
+            </w:tcBorders>
+            <w:tcMar>
+              <w:top w:type="dxa" w:w="60"/>
+              <w:left w:type="dxa" w:w="90"/>
+              <w:bottom w:type="dxa" w:w="60"/>
+              <w:right w:type="dxa" w:w="90"/>
+            </w:tcMar>
+          </w:tcPr>
+          <w:p>
+            <w:r>
+              <w:rPr>
+                <w:b w:val="false"/>
+                <w:bCs w:val="false"/>
+                <w:sz w:val="20"/>
+                <w:szCs w:val="20"/>
               </w:rPr>
               <w:t xml:space="preserve">All messages</w:t>
             </w:r>
@@ -1467,27 +1439,27 @@
         </w:tc>
         <w:tc>
           <w:tcPr>
-            <w:tcW w:type="dxa" w:w="1900"/>
-            <w:tcBorders>
-              <w:top w:val="single" w:color="8A9BB0" w:sz="4"/>
-              <w:left w:val="single" w:color="8A9BB0" w:sz="4"/>
-              <w:bottom w:val="single" w:color="8A9BB0" w:sz="4"/>
-              <w:right w:val="single" w:color="8A9BB0" w:sz="4"/>
-            </w:tcBorders>
-            <w:tcMar>
-              <w:top w:type="dxa" w:w="60"/>
-              <w:left w:type="dxa" w:w="90"/>
-              <w:bottom w:type="dxa" w:w="60"/>
-              <w:right w:type="dxa" w:w="90"/>
-            </w:tcMar>
-          </w:tcPr>
-          <w:p>
-            <w:r>
-              <w:rPr>
-                <w:b w:val="false"/>
-                <w:bCs w:val="false"/>
-                <w:sz w:val="18"/>
-                <w:szCs w:val="18"/>
+            <w:tcW w:type="dxa" w:w="1350"/>
+            <w:tcBorders>
+              <w:top w:val="single"/>
+              <w:left w:val="single"/>
+              <w:bottom w:val="single"/>
+              <w:right w:val="single"/>
+            </w:tcBorders>
+            <w:tcMar>
+              <w:top w:type="dxa" w:w="60"/>
+              <w:left w:type="dxa" w:w="90"/>
+              <w:bottom w:type="dxa" w:w="60"/>
+              <w:right w:type="dxa" w:w="90"/>
+            </w:tcMar>
+          </w:tcPr>
+          <w:p>
+            <w:r>
+              <w:rPr>
+                <w:b w:val="false"/>
+                <w:bCs w:val="false"/>
+                <w:sz w:val="20"/>
+                <w:szCs w:val="20"/>
               </w:rPr>
               <w:t xml:space="preserve">Next message; final result</w:t>
             </w:r>
@@ -1495,27 +1467,27 @@
         </w:tc>
         <w:tc>
           <w:tcPr>
-            <w:tcW w:type="dxa" w:w="2300"/>
-            <w:tcBorders>
-              <w:top w:val="single" w:color="8A9BB0" w:sz="4"/>
-              <w:left w:val="single" w:color="8A9BB0" w:sz="4"/>
-              <w:bottom w:val="single" w:color="8A9BB0" w:sz="4"/>
-              <w:right w:val="single" w:color="8A9BB0" w:sz="4"/>
-            </w:tcBorders>
-            <w:tcMar>
-              <w:top w:type="dxa" w:w="60"/>
-              <w:left w:type="dxa" w:w="90"/>
-              <w:bottom w:type="dxa" w:w="60"/>
-              <w:right w:type="dxa" w:w="90"/>
-            </w:tcMar>
-          </w:tcPr>
-          <w:p>
-            <w:r>
-              <w:rPr>
-                <w:b w:val="false"/>
-                <w:bCs w:val="false"/>
-                <w:sz w:val="18"/>
-                <w:szCs w:val="18"/>
+            <w:tcW w:type="dxa" w:w="1777"/>
+            <w:tcBorders>
+              <w:top w:val="single"/>
+              <w:left w:val="single"/>
+              <w:bottom w:val="single"/>
+              <w:right w:val="single"/>
+            </w:tcBorders>
+            <w:tcMar>
+              <w:top w:type="dxa" w:w="60"/>
+              <w:left w:type="dxa" w:w="90"/>
+              <w:bottom w:type="dxa" w:w="60"/>
+              <w:right w:type="dxa" w:w="90"/>
+            </w:tcMar>
+          </w:tcPr>
+          <w:p>
+            <w:r>
+              <w:rPr>
+                <w:b w:val="false"/>
+                <w:bCs w:val="false"/>
+                <w:sz w:val="20"/>
+                <w:szCs w:val="20"/>
               </w:rPr>
               <w:t xml:space="preserve">SQLite state store (no LLM)</w:t>
             </w:r>
@@ -1523,27 +1495,27 @@
         </w:tc>
         <w:tc>
           <w:tcPr>
-            <w:tcW w:type="dxa" w:w="2600"/>
-            <w:tcBorders>
-              <w:top w:val="single" w:color="8A9BB0" w:sz="4"/>
-              <w:left w:val="single" w:color="8A9BB0" w:sz="4"/>
-              <w:bottom w:val="single" w:color="8A9BB0" w:sz="4"/>
-              <w:right w:val="single" w:color="8A9BB0" w:sz="4"/>
-            </w:tcBorders>
-            <w:tcMar>
-              <w:top w:type="dxa" w:w="60"/>
-              <w:left w:type="dxa" w:w="90"/>
-              <w:bottom w:type="dxa" w:w="60"/>
-              <w:right w:type="dxa" w:w="90"/>
-            </w:tcMar>
-          </w:tcPr>
-          <w:p>
-            <w:r>
-              <w:rPr>
-                <w:b w:val="false"/>
-                <w:bCs w:val="false"/>
-                <w:sz w:val="18"/>
-                <w:szCs w:val="18"/>
+            <w:tcW w:type="dxa" w:w="1777"/>
+            <w:tcBorders>
+              <w:top w:val="single"/>
+              <w:left w:val="single"/>
+              <w:bottom w:val="single"/>
+              <w:right w:val="single"/>
+            </w:tcBorders>
+            <w:tcMar>
+              <w:top w:type="dxa" w:w="60"/>
+              <w:left w:type="dxa" w:w="90"/>
+              <w:bottom w:type="dxa" w:w="60"/>
+              <w:right w:type="dxa" w:w="90"/>
+            </w:tcMar>
+          </w:tcPr>
+          <w:p>
+            <w:r>
+              <w:rPr>
+                <w:b w:val="false"/>
+                <w:bCs w:val="false"/>
+                <w:sz w:val="20"/>
+                <w:szCs w:val="20"/>
               </w:rPr>
               <w:t xml:space="preserve">All cells finished or a limit reached</w:t>
             </w:r>
@@ -1556,14 +1528,13 @@
         </w:trPr>
         <w:tc>
           <w:tcPr>
-            <w:tcW w:type="dxa" w:w="1700"/>
-            <w:tcBorders>
-              <w:top w:val="single" w:color="8A9BB0" w:sz="4"/>
-              <w:left w:val="single" w:color="8A9BB0" w:sz="4"/>
-              <w:bottom w:val="single" w:color="8A9BB0" w:sz="4"/>
-              <w:right w:val="single" w:color="8A9BB0" w:sz="4"/>
-            </w:tcBorders>
-            <w:shd w:fill="F2F2F2" w:color="auto" w:val="clear"/>
+            <w:tcW w:type="dxa" w:w="1350"/>
+            <w:tcBorders>
+              <w:top w:val="single"/>
+              <w:left w:val="single"/>
+              <w:bottom w:val="single"/>
+              <w:right w:val="single"/>
+            </w:tcBorders>
             <w:tcMar>
               <w:top w:type="dxa" w:w="60"/>
               <w:left w:type="dxa" w:w="90"/>
@@ -1576,8 +1547,8 @@
               <w:rPr>
                 <w:b/>
                 <w:bCs/>
-                <w:sz w:val="18"/>
-                <w:szCs w:val="18"/>
+                <w:sz w:val="20"/>
+                <w:szCs w:val="20"/>
               </w:rPr>
               <w:t xml:space="preserve">Assembler (planned)</w:t>
             </w:r>
@@ -1585,28 +1556,27 @@
         </w:tc>
         <w:tc>
           <w:tcPr>
-            <w:tcW w:type="dxa" w:w="2300"/>
-            <w:tcBorders>
-              <w:top w:val="single" w:color="8A9BB0" w:sz="4"/>
-              <w:left w:val="single" w:color="8A9BB0" w:sz="4"/>
-              <w:bottom w:val="single" w:color="8A9BB0" w:sz="4"/>
-              <w:right w:val="single" w:color="8A9BB0" w:sz="4"/>
-            </w:tcBorders>
-            <w:shd w:fill="F2F2F2" w:color="auto" w:val="clear"/>
-            <w:tcMar>
-              <w:top w:type="dxa" w:w="60"/>
-              <w:left w:type="dxa" w:w="90"/>
-              <w:bottom w:type="dxa" w:w="60"/>
-              <w:right w:type="dxa" w:w="90"/>
-            </w:tcMar>
-          </w:tcPr>
-          <w:p>
-            <w:r>
-              <w:rPr>
-                <w:b w:val="false"/>
-                <w:bCs w:val="false"/>
-                <w:sz w:val="18"/>
-                <w:szCs w:val="18"/>
+            <w:tcW w:type="dxa" w:w="1564"/>
+            <w:tcBorders>
+              <w:top w:val="single"/>
+              <w:left w:val="single"/>
+              <w:bottom w:val="single"/>
+              <w:right w:val="single"/>
+            </w:tcBorders>
+            <w:tcMar>
+              <w:top w:type="dxa" w:w="60"/>
+              <w:left w:type="dxa" w:w="90"/>
+              <w:bottom w:type="dxa" w:w="60"/>
+              <w:right w:type="dxa" w:w="90"/>
+            </w:tcMar>
+          </w:tcPr>
+          <w:p>
+            <w:r>
+              <w:rPr>
+                <w:b w:val="false"/>
+                <w:bCs w:val="false"/>
+                <w:sz w:val="20"/>
+                <w:szCs w:val="20"/>
               </w:rPr>
               <w:t xml:space="preserve">Builds the final test document</w:t>
             </w:r>
@@ -1614,28 +1584,27 @@
         </w:tc>
         <w:tc>
           <w:tcPr>
-            <w:tcW w:type="dxa" w:w="1900"/>
-            <w:tcBorders>
-              <w:top w:val="single" w:color="8A9BB0" w:sz="4"/>
-              <w:left w:val="single" w:color="8A9BB0" w:sz="4"/>
-              <w:bottom w:val="single" w:color="8A9BB0" w:sz="4"/>
-              <w:right w:val="single" w:color="8A9BB0" w:sz="4"/>
-            </w:tcBorders>
-            <w:shd w:fill="F2F2F2" w:color="auto" w:val="clear"/>
-            <w:tcMar>
-              <w:top w:type="dxa" w:w="60"/>
-              <w:left w:type="dxa" w:w="90"/>
-              <w:bottom w:type="dxa" w:w="60"/>
-              <w:right w:type="dxa" w:w="90"/>
-            </w:tcMar>
-          </w:tcPr>
-          <w:p>
-            <w:r>
-              <w:rPr>
-                <w:b w:val="false"/>
-                <w:bCs w:val="false"/>
-                <w:sz w:val="18"/>
-                <w:szCs w:val="18"/>
+            <w:tcW w:type="dxa" w:w="1208"/>
+            <w:tcBorders>
+              <w:top w:val="single"/>
+              <w:left w:val="single"/>
+              <w:bottom w:val="single"/>
+              <w:right w:val="single"/>
+            </w:tcBorders>
+            <w:tcMar>
+              <w:top w:type="dxa" w:w="60"/>
+              <w:left w:type="dxa" w:w="90"/>
+              <w:bottom w:type="dxa" w:w="60"/>
+              <w:right w:type="dxa" w:w="90"/>
+            </w:tcMar>
+          </w:tcPr>
+          <w:p>
+            <w:r>
+              <w:rPr>
+                <w:b w:val="false"/>
+                <w:bCs w:val="false"/>
+                <w:sz w:val="20"/>
+                <w:szCs w:val="20"/>
               </w:rPr>
               <w:t xml:space="preserve">Accepted items</w:t>
             </w:r>
@@ -1643,28 +1612,27 @@
         </w:tc>
         <w:tc>
           <w:tcPr>
-            <w:tcW w:type="dxa" w:w="1900"/>
-            <w:tcBorders>
-              <w:top w:val="single" w:color="8A9BB0" w:sz="4"/>
-              <w:left w:val="single" w:color="8A9BB0" w:sz="4"/>
-              <w:bottom w:val="single" w:color="8A9BB0" w:sz="4"/>
-              <w:right w:val="single" w:color="8A9BB0" w:sz="4"/>
-            </w:tcBorders>
-            <w:shd w:fill="F2F2F2" w:color="auto" w:val="clear"/>
-            <w:tcMar>
-              <w:top w:type="dxa" w:w="60"/>
-              <w:left w:type="dxa" w:w="90"/>
-              <w:bottom w:type="dxa" w:w="60"/>
-              <w:right w:type="dxa" w:w="90"/>
-            </w:tcMar>
-          </w:tcPr>
-          <w:p>
-            <w:r>
-              <w:rPr>
-                <w:b w:val="false"/>
-                <w:bCs w:val="false"/>
-                <w:sz w:val="18"/>
-                <w:szCs w:val="18"/>
+            <w:tcW w:type="dxa" w:w="1350"/>
+            <w:tcBorders>
+              <w:top w:val="single"/>
+              <w:left w:val="single"/>
+              <w:bottom w:val="single"/>
+              <w:right w:val="single"/>
+            </w:tcBorders>
+            <w:tcMar>
+              <w:top w:type="dxa" w:w="60"/>
+              <w:left w:type="dxa" w:w="90"/>
+              <w:bottom w:type="dxa" w:w="60"/>
+              <w:right w:type="dxa" w:w="90"/>
+            </w:tcMar>
+          </w:tcPr>
+          <w:p>
+            <w:r>
+              <w:rPr>
+                <w:b w:val="false"/>
+                <w:bCs w:val="false"/>
+                <w:sz w:val="20"/>
+                <w:szCs w:val="20"/>
               </w:rPr>
               <w:t xml:space="preserve">Test file (now render.py writes Markdown)</w:t>
             </w:r>
@@ -1672,28 +1640,27 @@
         </w:tc>
         <w:tc>
           <w:tcPr>
-            <w:tcW w:type="dxa" w:w="2300"/>
-            <w:tcBorders>
-              <w:top w:val="single" w:color="8A9BB0" w:sz="4"/>
-              <w:left w:val="single" w:color="8A9BB0" w:sz="4"/>
-              <w:bottom w:val="single" w:color="8A9BB0" w:sz="4"/>
-              <w:right w:val="single" w:color="8A9BB0" w:sz="4"/>
-            </w:tcBorders>
-            <w:shd w:fill="F2F2F2" w:color="auto" w:val="clear"/>
-            <w:tcMar>
-              <w:top w:type="dxa" w:w="60"/>
-              <w:left w:type="dxa" w:w="90"/>
-              <w:bottom w:type="dxa" w:w="60"/>
-              <w:right w:type="dxa" w:w="90"/>
-            </w:tcMar>
-          </w:tcPr>
-          <w:p>
-            <w:r>
-              <w:rPr>
-                <w:b w:val="false"/>
-                <w:bCs w:val="false"/>
-                <w:sz w:val="18"/>
-                <w:szCs w:val="18"/>
+            <w:tcW w:type="dxa" w:w="1777"/>
+            <w:tcBorders>
+              <w:top w:val="single"/>
+              <w:left w:val="single"/>
+              <w:bottom w:val="single"/>
+              <w:right w:val="single"/>
+            </w:tcBorders>
+            <w:tcMar>
+              <w:top w:type="dxa" w:w="60"/>
+              <w:left w:type="dxa" w:w="90"/>
+              <w:bottom w:type="dxa" w:w="60"/>
+              <w:right w:type="dxa" w:w="90"/>
+            </w:tcMar>
+          </w:tcPr>
+          <w:p>
+            <w:r>
+              <w:rPr>
+                <w:b w:val="false"/>
+                <w:bCs w:val="false"/>
+                <w:sz w:val="20"/>
+                <w:szCs w:val="20"/>
               </w:rPr>
               <w:t xml:space="preserve">Not built yet</w:t>
             </w:r>
@@ -1701,28 +1668,27 @@
         </w:tc>
         <w:tc>
           <w:tcPr>
-            <w:tcW w:type="dxa" w:w="2600"/>
-            <w:tcBorders>
-              <w:top w:val="single" w:color="8A9BB0" w:sz="4"/>
-              <w:left w:val="single" w:color="8A9BB0" w:sz="4"/>
-              <w:bottom w:val="single" w:color="8A9BB0" w:sz="4"/>
-              <w:right w:val="single" w:color="8A9BB0" w:sz="4"/>
-            </w:tcBorders>
-            <w:shd w:fill="F2F2F2" w:color="auto" w:val="clear"/>
-            <w:tcMar>
-              <w:top w:type="dxa" w:w="60"/>
-              <w:left w:type="dxa" w:w="90"/>
-              <w:bottom w:type="dxa" w:w="60"/>
-              <w:right w:type="dxa" w:w="90"/>
-            </w:tcMar>
-          </w:tcPr>
-          <w:p>
-            <w:r>
-              <w:rPr>
-                <w:b w:val="false"/>
-                <w:bCs w:val="false"/>
-                <w:sz w:val="18"/>
-                <w:szCs w:val="18"/>
+            <w:tcW w:type="dxa" w:w="1777"/>
+            <w:tcBorders>
+              <w:top w:val="single"/>
+              <w:left w:val="single"/>
+              <w:bottom w:val="single"/>
+              <w:right w:val="single"/>
+            </w:tcBorders>
+            <w:tcMar>
+              <w:top w:type="dxa" w:w="60"/>
+              <w:left w:type="dxa" w:w="90"/>
+              <w:bottom w:type="dxa" w:w="60"/>
+              <w:right w:type="dxa" w:w="90"/>
+            </w:tcMar>
+          </w:tcPr>
+          <w:p>
+            <w:r>
+              <w:rPr>
+                <w:b w:val="false"/>
+                <w:bCs w:val="false"/>
+                <w:sz w:val="20"/>
+                <w:szCs w:val="20"/>
               </w:rPr>
               <w:t xml:space="preserve">Planned</w:t>
             </w:r>
@@ -1734,20 +1700,11 @@
       <w:pPr>
         <w:spacing w:before="120"/>
         <w:jc w:val="center"/>
-        <w:sectPr>
-          <w:footerReference w:type="default" r:id="rId7"/>
-          <w:pgSz w:w="16838" w:h="11906" w:orient="landscape"/>
-          <w:pgMar w:top="1000" w:right="1100" w:bottom="1000" w:left="1100" w:header="708" w:footer="708" w:gutter="0"/>
-          <w:pgNumType/>
-          <w:docGrid w:linePitch="360"/>
-        </w:sectPr>
       </w:pPr>
       <w:r>
         <w:rPr>
           <w:i/>
           <w:iCs/>
-          <w:sz w:val="20"/>
-          <w:szCs w:val="20"/>
         </w:rPr>
         <w:t xml:space="preserve">Table 1. Agents, their inputs, outputs, tools and stop conditions.</w:t>
       </w:r>
@@ -1864,7 +1821,7 @@
     </w:p>
     <w:tbl>
       <w:tblPr>
-        <w:tblW w:type="dxa" w:w="6800"/>
+        <w:tblW w:type="dxa" w:w="9026"/>
         <w:tblBorders>
           <w:top w:val="single" w:color="auto" w:sz="4"/>
           <w:left w:val="single" w:color="auto" w:sz="4"/>
@@ -1875,9 +1832,9 @@
         </w:tblBorders>
       </w:tblPr>
       <w:tblGrid>
-        <w:gridCol w:w="3200"/>
-        <w:gridCol w:w="1800"/>
-        <w:gridCol w:w="1800"/>
+        <w:gridCol w:w="4248"/>
+        <w:gridCol w:w="2389"/>
+        <w:gridCol w:w="2389"/>
       </w:tblGrid>
       <w:tr>
         <w:trPr>
@@ -1885,14 +1842,13 @@
         </w:trPr>
         <w:tc>
           <w:tcPr>
-            <w:tcW w:type="dxa" w:w="3200"/>
-            <w:tcBorders>
-              <w:top w:val="single" w:color="8A9BB0" w:sz="4"/>
-              <w:left w:val="single" w:color="8A9BB0" w:sz="4"/>
-              <w:bottom w:val="single" w:color="8A9BB0" w:sz="4"/>
-              <w:right w:val="single" w:color="8A9BB0" w:sz="4"/>
-            </w:tcBorders>
-            <w:shd w:fill="DCE8F7" w:color="auto" w:val="clear"/>
+            <w:tcW w:type="dxa" w:w="4248"/>
+            <w:tcBorders>
+              <w:top w:val="single"/>
+              <w:left w:val="single"/>
+              <w:bottom w:val="single"/>
+              <w:right w:val="single"/>
+            </w:tcBorders>
             <w:tcMar>
               <w:top w:type="dxa" w:w="60"/>
               <w:left w:type="dxa" w:w="90"/>
@@ -1905,8 +1861,8 @@
               <w:rPr>
                 <w:b/>
                 <w:bCs/>
-                <w:sz w:val="18"/>
-                <w:szCs w:val="18"/>
+                <w:sz w:val="20"/>
+                <w:szCs w:val="20"/>
               </w:rPr>
               <w:t xml:space="preserve">Agent</w:t>
             </w:r>
@@ -1914,14 +1870,13 @@
         </w:tc>
         <w:tc>
           <w:tcPr>
-            <w:tcW w:type="dxa" w:w="1800"/>
-            <w:tcBorders>
-              <w:top w:val="single" w:color="8A9BB0" w:sz="4"/>
-              <w:left w:val="single" w:color="8A9BB0" w:sz="4"/>
-              <w:bottom w:val="single" w:color="8A9BB0" w:sz="4"/>
-              <w:right w:val="single" w:color="8A9BB0" w:sz="4"/>
-            </w:tcBorders>
-            <w:shd w:fill="DCE8F7" w:color="auto" w:val="clear"/>
+            <w:tcW w:type="dxa" w:w="2389"/>
+            <w:tcBorders>
+              <w:top w:val="single"/>
+              <w:left w:val="single"/>
+              <w:bottom w:val="single"/>
+              <w:right w:val="single"/>
+            </w:tcBorders>
             <w:tcMar>
               <w:top w:type="dxa" w:w="60"/>
               <w:left w:type="dxa" w:w="90"/>
@@ -1934,8 +1889,8 @@
               <w:rPr>
                 <w:b/>
                 <w:bCs/>
-                <w:sz w:val="18"/>
-                <w:szCs w:val="18"/>
+                <w:sz w:val="20"/>
+                <w:szCs w:val="20"/>
               </w:rPr>
               <w:t xml:space="preserve">Calls</w:t>
             </w:r>
@@ -1943,14 +1898,13 @@
         </w:tc>
         <w:tc>
           <w:tcPr>
-            <w:tcW w:type="dxa" w:w="1800"/>
-            <w:tcBorders>
-              <w:top w:val="single" w:color="8A9BB0" w:sz="4"/>
-              <w:left w:val="single" w:color="8A9BB0" w:sz="4"/>
-              <w:bottom w:val="single" w:color="8A9BB0" w:sz="4"/>
-              <w:right w:val="single" w:color="8A9BB0" w:sz="4"/>
-            </w:tcBorders>
-            <w:shd w:fill="DCE8F7" w:color="auto" w:val="clear"/>
+            <w:tcW w:type="dxa" w:w="2389"/>
+            <w:tcBorders>
+              <w:top w:val="single"/>
+              <w:left w:val="single"/>
+              <w:bottom w:val="single"/>
+              <w:right w:val="single"/>
+            </w:tcBorders>
             <w:tcMar>
               <w:top w:type="dxa" w:w="60"/>
               <w:left w:type="dxa" w:w="90"/>
@@ -1963,8 +1917,8 @@
               <w:rPr>
                 <w:b/>
                 <w:bCs/>
-                <w:sz w:val="18"/>
-                <w:szCs w:val="18"/>
+                <w:sz w:val="20"/>
+                <w:szCs w:val="20"/>
               </w:rPr>
               <w:t xml:space="preserve">Share</w:t>
             </w:r>
@@ -1977,12 +1931,12 @@
         </w:trPr>
         <w:tc>
           <w:tcPr>
-            <w:tcW w:type="dxa" w:w="3200"/>
-            <w:tcBorders>
-              <w:top w:val="single" w:color="8A9BB0" w:sz="4"/>
-              <w:left w:val="single" w:color="8A9BB0" w:sz="4"/>
-              <w:bottom w:val="single" w:color="8A9BB0" w:sz="4"/>
-              <w:right w:val="single" w:color="8A9BB0" w:sz="4"/>
+            <w:tcW w:type="dxa" w:w="4248"/>
+            <w:tcBorders>
+              <w:top w:val="single"/>
+              <w:left w:val="single"/>
+              <w:bottom w:val="single"/>
+              <w:right w:val="single"/>
             </w:tcBorders>
             <w:tcMar>
               <w:top w:type="dxa" w:w="60"/>
@@ -1996,8 +1950,8 @@
               <w:rPr>
                 <w:b/>
                 <w:bCs/>
-                <w:sz w:val="18"/>
-                <w:szCs w:val="18"/>
+                <w:sz w:val="20"/>
+                <w:szCs w:val="20"/>
               </w:rPr>
               <w:t xml:space="preserve">Quality Verifier</w:t>
             </w:r>
@@ -2005,27 +1959,27 @@
         </w:tc>
         <w:tc>
           <w:tcPr>
-            <w:tcW w:type="dxa" w:w="1800"/>
-            <w:tcBorders>
-              <w:top w:val="single" w:color="8A9BB0" w:sz="4"/>
-              <w:left w:val="single" w:color="8A9BB0" w:sz="4"/>
-              <w:bottom w:val="single" w:color="8A9BB0" w:sz="4"/>
-              <w:right w:val="single" w:color="8A9BB0" w:sz="4"/>
-            </w:tcBorders>
-            <w:tcMar>
-              <w:top w:type="dxa" w:w="60"/>
-              <w:left w:type="dxa" w:w="90"/>
-              <w:bottom w:type="dxa" w:w="60"/>
-              <w:right w:type="dxa" w:w="90"/>
-            </w:tcMar>
-          </w:tcPr>
-          <w:p>
-            <w:r>
-              <w:rPr>
-                <w:b w:val="false"/>
-                <w:bCs w:val="false"/>
-                <w:sz w:val="18"/>
-                <w:szCs w:val="18"/>
+            <w:tcW w:type="dxa" w:w="2389"/>
+            <w:tcBorders>
+              <w:top w:val="single"/>
+              <w:left w:val="single"/>
+              <w:bottom w:val="single"/>
+              <w:right w:val="single"/>
+            </w:tcBorders>
+            <w:tcMar>
+              <w:top w:type="dxa" w:w="60"/>
+              <w:left w:type="dxa" w:w="90"/>
+              <w:bottom w:type="dxa" w:w="60"/>
+              <w:right w:type="dxa" w:w="90"/>
+            </w:tcMar>
+          </w:tcPr>
+          <w:p>
+            <w:r>
+              <w:rPr>
+                <w:b w:val="false"/>
+                <w:bCs w:val="false"/>
+                <w:sz w:val="20"/>
+                <w:szCs w:val="20"/>
               </w:rPr>
               <w:t xml:space="preserve">8</w:t>
             </w:r>
@@ -2033,27 +1987,27 @@
         </w:tc>
         <w:tc>
           <w:tcPr>
-            <w:tcW w:type="dxa" w:w="1800"/>
-            <w:tcBorders>
-              <w:top w:val="single" w:color="8A9BB0" w:sz="4"/>
-              <w:left w:val="single" w:color="8A9BB0" w:sz="4"/>
-              <w:bottom w:val="single" w:color="8A9BB0" w:sz="4"/>
-              <w:right w:val="single" w:color="8A9BB0" w:sz="4"/>
-            </w:tcBorders>
-            <w:tcMar>
-              <w:top w:type="dxa" w:w="60"/>
-              <w:left w:type="dxa" w:w="90"/>
-              <w:bottom w:type="dxa" w:w="60"/>
-              <w:right w:type="dxa" w:w="90"/>
-            </w:tcMar>
-          </w:tcPr>
-          <w:p>
-            <w:r>
-              <w:rPr>
-                <w:b w:val="false"/>
-                <w:bCs w:val="false"/>
-                <w:sz w:val="18"/>
-                <w:szCs w:val="18"/>
+            <w:tcW w:type="dxa" w:w="2389"/>
+            <w:tcBorders>
+              <w:top w:val="single"/>
+              <w:left w:val="single"/>
+              <w:bottom w:val="single"/>
+              <w:right w:val="single"/>
+            </w:tcBorders>
+            <w:tcMar>
+              <w:top w:type="dxa" w:w="60"/>
+              <w:left w:type="dxa" w:w="90"/>
+              <w:bottom w:type="dxa" w:w="60"/>
+              <w:right w:type="dxa" w:w="90"/>
+            </w:tcMar>
+          </w:tcPr>
+          <w:p>
+            <w:r>
+              <w:rPr>
+                <w:b w:val="false"/>
+                <w:bCs w:val="false"/>
+                <w:sz w:val="20"/>
+                <w:szCs w:val="20"/>
               </w:rPr>
               <w:t xml:space="preserve">29%</w:t>
             </w:r>
@@ -2066,12 +2020,12 @@
         </w:trPr>
         <w:tc>
           <w:tcPr>
-            <w:tcW w:type="dxa" w:w="3200"/>
-            <w:tcBorders>
-              <w:top w:val="single" w:color="8A9BB0" w:sz="4"/>
-              <w:left w:val="single" w:color="8A9BB0" w:sz="4"/>
-              <w:bottom w:val="single" w:color="8A9BB0" w:sz="4"/>
-              <w:right w:val="single" w:color="8A9BB0" w:sz="4"/>
+            <w:tcW w:type="dxa" w:w="4248"/>
+            <w:tcBorders>
+              <w:top w:val="single"/>
+              <w:left w:val="single"/>
+              <w:bottom w:val="single"/>
+              <w:right w:val="single"/>
             </w:tcBorders>
             <w:tcMar>
               <w:top w:type="dxa" w:w="60"/>
@@ -2085,8 +2039,8 @@
               <w:rPr>
                 <w:b/>
                 <w:bCs/>
-                <w:sz w:val="18"/>
-                <w:szCs w:val="18"/>
+                <w:sz w:val="20"/>
+                <w:szCs w:val="20"/>
               </w:rPr>
               <w:t xml:space="preserve">Item Writer</w:t>
             </w:r>
@@ -2094,27 +2048,27 @@
         </w:tc>
         <w:tc>
           <w:tcPr>
-            <w:tcW w:type="dxa" w:w="1800"/>
-            <w:tcBorders>
-              <w:top w:val="single" w:color="8A9BB0" w:sz="4"/>
-              <w:left w:val="single" w:color="8A9BB0" w:sz="4"/>
-              <w:bottom w:val="single" w:color="8A9BB0" w:sz="4"/>
-              <w:right w:val="single" w:color="8A9BB0" w:sz="4"/>
-            </w:tcBorders>
-            <w:tcMar>
-              <w:top w:type="dxa" w:w="60"/>
-              <w:left w:type="dxa" w:w="90"/>
-              <w:bottom w:type="dxa" w:w="60"/>
-              <w:right w:type="dxa" w:w="90"/>
-            </w:tcMar>
-          </w:tcPr>
-          <w:p>
-            <w:r>
-              <w:rPr>
-                <w:b w:val="false"/>
-                <w:bCs w:val="false"/>
-                <w:sz w:val="18"/>
-                <w:szCs w:val="18"/>
+            <w:tcW w:type="dxa" w:w="2389"/>
+            <w:tcBorders>
+              <w:top w:val="single"/>
+              <w:left w:val="single"/>
+              <w:bottom w:val="single"/>
+              <w:right w:val="single"/>
+            </w:tcBorders>
+            <w:tcMar>
+              <w:top w:type="dxa" w:w="60"/>
+              <w:left w:type="dxa" w:w="90"/>
+              <w:bottom w:type="dxa" w:w="60"/>
+              <w:right w:type="dxa" w:w="90"/>
+            </w:tcMar>
+          </w:tcPr>
+          <w:p>
+            <w:r>
+              <w:rPr>
+                <w:b w:val="false"/>
+                <w:bCs w:val="false"/>
+                <w:sz w:val="20"/>
+                <w:szCs w:val="20"/>
               </w:rPr>
               <w:t xml:space="preserve">7</w:t>
             </w:r>
@@ -2122,27 +2076,27 @@
         </w:tc>
         <w:tc>
           <w:tcPr>
-            <w:tcW w:type="dxa" w:w="1800"/>
-            <w:tcBorders>
-              <w:top w:val="single" w:color="8A9BB0" w:sz="4"/>
-              <w:left w:val="single" w:color="8A9BB0" w:sz="4"/>
-              <w:bottom w:val="single" w:color="8A9BB0" w:sz="4"/>
-              <w:right w:val="single" w:color="8A9BB0" w:sz="4"/>
-            </w:tcBorders>
-            <w:tcMar>
-              <w:top w:type="dxa" w:w="60"/>
-              <w:left w:type="dxa" w:w="90"/>
-              <w:bottom w:type="dxa" w:w="60"/>
-              <w:right w:type="dxa" w:w="90"/>
-            </w:tcMar>
-          </w:tcPr>
-          <w:p>
-            <w:r>
-              <w:rPr>
-                <w:b w:val="false"/>
-                <w:bCs w:val="false"/>
-                <w:sz w:val="18"/>
-                <w:szCs w:val="18"/>
+            <w:tcW w:type="dxa" w:w="2389"/>
+            <w:tcBorders>
+              <w:top w:val="single"/>
+              <w:left w:val="single"/>
+              <w:bottom w:val="single"/>
+              <w:right w:val="single"/>
+            </w:tcBorders>
+            <w:tcMar>
+              <w:top w:type="dxa" w:w="60"/>
+              <w:left w:type="dxa" w:w="90"/>
+              <w:bottom w:type="dxa" w:w="60"/>
+              <w:right w:type="dxa" w:w="90"/>
+            </w:tcMar>
+          </w:tcPr>
+          <w:p>
+            <w:r>
+              <w:rPr>
+                <w:b w:val="false"/>
+                <w:bCs w:val="false"/>
+                <w:sz w:val="20"/>
+                <w:szCs w:val="20"/>
               </w:rPr>
               <w:t xml:space="preserve">25%</w:t>
             </w:r>
@@ -2155,12 +2109,12 @@
         </w:trPr>
         <w:tc>
           <w:tcPr>
-            <w:tcW w:type="dxa" w:w="3200"/>
-            <w:tcBorders>
-              <w:top w:val="single" w:color="8A9BB0" w:sz="4"/>
-              <w:left w:val="single" w:color="8A9BB0" w:sz="4"/>
-              <w:bottom w:val="single" w:color="8A9BB0" w:sz="4"/>
-              <w:right w:val="single" w:color="8A9BB0" w:sz="4"/>
+            <w:tcW w:type="dxa" w:w="4248"/>
+            <w:tcBorders>
+              <w:top w:val="single"/>
+              <w:left w:val="single"/>
+              <w:bottom w:val="single"/>
+              <w:right w:val="single"/>
             </w:tcBorders>
             <w:tcMar>
               <w:top w:type="dxa" w:w="60"/>
@@ -2174,8 +2128,8 @@
               <w:rPr>
                 <w:b/>
                 <w:bCs/>
-                <w:sz w:val="18"/>
-                <w:szCs w:val="18"/>
+                <w:sz w:val="20"/>
+                <w:szCs w:val="20"/>
               </w:rPr>
               <w:t xml:space="preserve">Alignment Reviewer</w:t>
             </w:r>
@@ -2183,27 +2137,27 @@
         </w:tc>
         <w:tc>
           <w:tcPr>
-            <w:tcW w:type="dxa" w:w="1800"/>
-            <w:tcBorders>
-              <w:top w:val="single" w:color="8A9BB0" w:sz="4"/>
-              <w:left w:val="single" w:color="8A9BB0" w:sz="4"/>
-              <w:bottom w:val="single" w:color="8A9BB0" w:sz="4"/>
-              <w:right w:val="single" w:color="8A9BB0" w:sz="4"/>
-            </w:tcBorders>
-            <w:tcMar>
-              <w:top w:type="dxa" w:w="60"/>
-              <w:left w:type="dxa" w:w="90"/>
-              <w:bottom w:type="dxa" w:w="60"/>
-              <w:right w:type="dxa" w:w="90"/>
-            </w:tcMar>
-          </w:tcPr>
-          <w:p>
-            <w:r>
-              <w:rPr>
-                <w:b w:val="false"/>
-                <w:bCs w:val="false"/>
-                <w:sz w:val="18"/>
-                <w:szCs w:val="18"/>
+            <w:tcW w:type="dxa" w:w="2389"/>
+            <w:tcBorders>
+              <w:top w:val="single"/>
+              <w:left w:val="single"/>
+              <w:bottom w:val="single"/>
+              <w:right w:val="single"/>
+            </w:tcBorders>
+            <w:tcMar>
+              <w:top w:type="dxa" w:w="60"/>
+              <w:left w:type="dxa" w:w="90"/>
+              <w:bottom w:type="dxa" w:w="60"/>
+              <w:right w:type="dxa" w:w="90"/>
+            </w:tcMar>
+          </w:tcPr>
+          <w:p>
+            <w:r>
+              <w:rPr>
+                <w:b w:val="false"/>
+                <w:bCs w:val="false"/>
+                <w:sz w:val="20"/>
+                <w:szCs w:val="20"/>
               </w:rPr>
               <w:t xml:space="preserve">5</w:t>
             </w:r>
@@ -2211,27 +2165,27 @@
         </w:tc>
         <w:tc>
           <w:tcPr>
-            <w:tcW w:type="dxa" w:w="1800"/>
-            <w:tcBorders>
-              <w:top w:val="single" w:color="8A9BB0" w:sz="4"/>
-              <w:left w:val="single" w:color="8A9BB0" w:sz="4"/>
-              <w:bottom w:val="single" w:color="8A9BB0" w:sz="4"/>
-              <w:right w:val="single" w:color="8A9BB0" w:sz="4"/>
-            </w:tcBorders>
-            <w:tcMar>
-              <w:top w:type="dxa" w:w="60"/>
-              <w:left w:type="dxa" w:w="90"/>
-              <w:bottom w:type="dxa" w:w="60"/>
-              <w:right w:type="dxa" w:w="90"/>
-            </w:tcMar>
-          </w:tcPr>
-          <w:p>
-            <w:r>
-              <w:rPr>
-                <w:b w:val="false"/>
-                <w:bCs w:val="false"/>
-                <w:sz w:val="18"/>
-                <w:szCs w:val="18"/>
+            <w:tcW w:type="dxa" w:w="2389"/>
+            <w:tcBorders>
+              <w:top w:val="single"/>
+              <w:left w:val="single"/>
+              <w:bottom w:val="single"/>
+              <w:right w:val="single"/>
+            </w:tcBorders>
+            <w:tcMar>
+              <w:top w:type="dxa" w:w="60"/>
+              <w:left w:type="dxa" w:w="90"/>
+              <w:bottom w:type="dxa" w:w="60"/>
+              <w:right w:type="dxa" w:w="90"/>
+            </w:tcMar>
+          </w:tcPr>
+          <w:p>
+            <w:r>
+              <w:rPr>
+                <w:b w:val="false"/>
+                <w:bCs w:val="false"/>
+                <w:sz w:val="20"/>
+                <w:szCs w:val="20"/>
               </w:rPr>
               <w:t xml:space="preserve">18%</w:t>
             </w:r>
@@ -2244,12 +2198,12 @@
         </w:trPr>
         <w:tc>
           <w:tcPr>
-            <w:tcW w:type="dxa" w:w="3200"/>
-            <w:tcBorders>
-              <w:top w:val="single" w:color="8A9BB0" w:sz="4"/>
-              <w:left w:val="single" w:color="8A9BB0" w:sz="4"/>
-              <w:bottom w:val="single" w:color="8A9BB0" w:sz="4"/>
-              <w:right w:val="single" w:color="8A9BB0" w:sz="4"/>
+            <w:tcW w:type="dxa" w:w="4248"/>
+            <w:tcBorders>
+              <w:top w:val="single"/>
+              <w:left w:val="single"/>
+              <w:bottom w:val="single"/>
+              <w:right w:val="single"/>
             </w:tcBorders>
             <w:tcMar>
               <w:top w:type="dxa" w:w="60"/>
@@ -2263,8 +2217,8 @@
               <w:rPr>
                 <w:b/>
                 <w:bCs/>
-                <w:sz w:val="18"/>
-                <w:szCs w:val="18"/>
+                <w:sz w:val="20"/>
+                <w:szCs w:val="20"/>
               </w:rPr>
               <w:t xml:space="preserve">Distractor Designer</w:t>
             </w:r>
@@ -2272,27 +2226,27 @@
         </w:tc>
         <w:tc>
           <w:tcPr>
-            <w:tcW w:type="dxa" w:w="1800"/>
-            <w:tcBorders>
-              <w:top w:val="single" w:color="8A9BB0" w:sz="4"/>
-              <w:left w:val="single" w:color="8A9BB0" w:sz="4"/>
-              <w:bottom w:val="single" w:color="8A9BB0" w:sz="4"/>
-              <w:right w:val="single" w:color="8A9BB0" w:sz="4"/>
-            </w:tcBorders>
-            <w:tcMar>
-              <w:top w:type="dxa" w:w="60"/>
-              <w:left w:type="dxa" w:w="90"/>
-              <w:bottom w:type="dxa" w:w="60"/>
-              <w:right w:type="dxa" w:w="90"/>
-            </w:tcMar>
-          </w:tcPr>
-          <w:p>
-            <w:r>
-              <w:rPr>
-                <w:b w:val="false"/>
-                <w:bCs w:val="false"/>
-                <w:sz w:val="18"/>
-                <w:szCs w:val="18"/>
+            <w:tcW w:type="dxa" w:w="2389"/>
+            <w:tcBorders>
+              <w:top w:val="single"/>
+              <w:left w:val="single"/>
+              <w:bottom w:val="single"/>
+              <w:right w:val="single"/>
+            </w:tcBorders>
+            <w:tcMar>
+              <w:top w:type="dxa" w:w="60"/>
+              <w:left w:type="dxa" w:w="90"/>
+              <w:bottom w:type="dxa" w:w="60"/>
+              <w:right w:type="dxa" w:w="90"/>
+            </w:tcMar>
+          </w:tcPr>
+          <w:p>
+            <w:r>
+              <w:rPr>
+                <w:b w:val="false"/>
+                <w:bCs w:val="false"/>
+                <w:sz w:val="20"/>
+                <w:szCs w:val="20"/>
               </w:rPr>
               <w:t xml:space="preserve">5</w:t>
             </w:r>
@@ -2300,27 +2254,27 @@
         </w:tc>
         <w:tc>
           <w:tcPr>
-            <w:tcW w:type="dxa" w:w="1800"/>
-            <w:tcBorders>
-              <w:top w:val="single" w:color="8A9BB0" w:sz="4"/>
-              <w:left w:val="single" w:color="8A9BB0" w:sz="4"/>
-              <w:bottom w:val="single" w:color="8A9BB0" w:sz="4"/>
-              <w:right w:val="single" w:color="8A9BB0" w:sz="4"/>
-            </w:tcBorders>
-            <w:tcMar>
-              <w:top w:type="dxa" w:w="60"/>
-              <w:left w:type="dxa" w:w="90"/>
-              <w:bottom w:type="dxa" w:w="60"/>
-              <w:right w:type="dxa" w:w="90"/>
-            </w:tcMar>
-          </w:tcPr>
-          <w:p>
-            <w:r>
-              <w:rPr>
-                <w:b w:val="false"/>
-                <w:bCs w:val="false"/>
-                <w:sz w:val="18"/>
-                <w:szCs w:val="18"/>
+            <w:tcW w:type="dxa" w:w="2389"/>
+            <w:tcBorders>
+              <w:top w:val="single"/>
+              <w:left w:val="single"/>
+              <w:bottom w:val="single"/>
+              <w:right w:val="single"/>
+            </w:tcBorders>
+            <w:tcMar>
+              <w:top w:type="dxa" w:w="60"/>
+              <w:left w:type="dxa" w:w="90"/>
+              <w:bottom w:type="dxa" w:w="60"/>
+              <w:right w:type="dxa" w:w="90"/>
+            </w:tcMar>
+          </w:tcPr>
+          <w:p>
+            <w:r>
+              <w:rPr>
+                <w:b w:val="false"/>
+                <w:bCs w:val="false"/>
+                <w:sz w:val="20"/>
+                <w:szCs w:val="20"/>
               </w:rPr>
               <w:t xml:space="preserve">18%</w:t>
             </w:r>
@@ -2333,12 +2287,12 @@
         </w:trPr>
         <w:tc>
           <w:tcPr>
-            <w:tcW w:type="dxa" w:w="3200"/>
-            <w:tcBorders>
-              <w:top w:val="single" w:color="8A9BB0" w:sz="4"/>
-              <w:left w:val="single" w:color="8A9BB0" w:sz="4"/>
-              <w:bottom w:val="single" w:color="8A9BB0" w:sz="4"/>
-              <w:right w:val="single" w:color="8A9BB0" w:sz="4"/>
+            <w:tcW w:type="dxa" w:w="4248"/>
+            <w:tcBorders>
+              <w:top w:val="single"/>
+              <w:left w:val="single"/>
+              <w:bottom w:val="single"/>
+              <w:right w:val="single"/>
             </w:tcBorders>
             <w:tcMar>
               <w:top w:type="dxa" w:w="60"/>
@@ -2352,8 +2306,8 @@
               <w:rPr>
                 <w:b/>
                 <w:bCs/>
-                <w:sz w:val="18"/>
-                <w:szCs w:val="18"/>
+                <w:sz w:val="20"/>
+                <w:szCs w:val="20"/>
               </w:rPr>
               <w:t xml:space="preserve">Profile Analyst</w:t>
             </w:r>
@@ -2361,27 +2315,27 @@
         </w:tc>
         <w:tc>
           <w:tcPr>
-            <w:tcW w:type="dxa" w:w="1800"/>
-            <w:tcBorders>
-              <w:top w:val="single" w:color="8A9BB0" w:sz="4"/>
-              <w:left w:val="single" w:color="8A9BB0" w:sz="4"/>
-              <w:bottom w:val="single" w:color="8A9BB0" w:sz="4"/>
-              <w:right w:val="single" w:color="8A9BB0" w:sz="4"/>
-            </w:tcBorders>
-            <w:tcMar>
-              <w:top w:type="dxa" w:w="60"/>
-              <w:left w:type="dxa" w:w="90"/>
-              <w:bottom w:type="dxa" w:w="60"/>
-              <w:right w:type="dxa" w:w="90"/>
-            </w:tcMar>
-          </w:tcPr>
-          <w:p>
-            <w:r>
-              <w:rPr>
-                <w:b w:val="false"/>
-                <w:bCs w:val="false"/>
-                <w:sz w:val="18"/>
-                <w:szCs w:val="18"/>
+            <w:tcW w:type="dxa" w:w="2389"/>
+            <w:tcBorders>
+              <w:top w:val="single"/>
+              <w:left w:val="single"/>
+              <w:bottom w:val="single"/>
+              <w:right w:val="single"/>
+            </w:tcBorders>
+            <w:tcMar>
+              <w:top w:type="dxa" w:w="60"/>
+              <w:left w:type="dxa" w:w="90"/>
+              <w:bottom w:type="dxa" w:w="60"/>
+              <w:right w:type="dxa" w:w="90"/>
+            </w:tcMar>
+          </w:tcPr>
+          <w:p>
+            <w:r>
+              <w:rPr>
+                <w:b w:val="false"/>
+                <w:bCs w:val="false"/>
+                <w:sz w:val="20"/>
+                <w:szCs w:val="20"/>
               </w:rPr>
               <w:t xml:space="preserve">3</w:t>
             </w:r>
@@ -2389,27 +2343,27 @@
         </w:tc>
         <w:tc>
           <w:tcPr>
-            <w:tcW w:type="dxa" w:w="1800"/>
-            <w:tcBorders>
-              <w:top w:val="single" w:color="8A9BB0" w:sz="4"/>
-              <w:left w:val="single" w:color="8A9BB0" w:sz="4"/>
-              <w:bottom w:val="single" w:color="8A9BB0" w:sz="4"/>
-              <w:right w:val="single" w:color="8A9BB0" w:sz="4"/>
-            </w:tcBorders>
-            <w:tcMar>
-              <w:top w:type="dxa" w:w="60"/>
-              <w:left w:type="dxa" w:w="90"/>
-              <w:bottom w:type="dxa" w:w="60"/>
-              <w:right w:type="dxa" w:w="90"/>
-            </w:tcMar>
-          </w:tcPr>
-          <w:p>
-            <w:r>
-              <w:rPr>
-                <w:b w:val="false"/>
-                <w:bCs w:val="false"/>
-                <w:sz w:val="18"/>
-                <w:szCs w:val="18"/>
+            <w:tcW w:type="dxa" w:w="2389"/>
+            <w:tcBorders>
+              <w:top w:val="single"/>
+              <w:left w:val="single"/>
+              <w:bottom w:val="single"/>
+              <w:right w:val="single"/>
+            </w:tcBorders>
+            <w:tcMar>
+              <w:top w:type="dxa" w:w="60"/>
+              <w:left w:type="dxa" w:w="90"/>
+              <w:bottom w:type="dxa" w:w="60"/>
+              <w:right w:type="dxa" w:w="90"/>
+            </w:tcMar>
+          </w:tcPr>
+          <w:p>
+            <w:r>
+              <w:rPr>
+                <w:b w:val="false"/>
+                <w:bCs w:val="false"/>
+                <w:sz w:val="20"/>
+                <w:szCs w:val="20"/>
               </w:rPr>
               <w:t xml:space="preserve">11%</w:t>
             </w:r>
@@ -2422,12 +2376,12 @@
         </w:trPr>
         <w:tc>
           <w:tcPr>
-            <w:tcW w:type="dxa" w:w="3200"/>
-            <w:tcBorders>
-              <w:top w:val="single" w:color="8A9BB0" w:sz="4"/>
-              <w:left w:val="single" w:color="8A9BB0" w:sz="4"/>
-              <w:bottom w:val="single" w:color="8A9BB0" w:sz="4"/>
-              <w:right w:val="single" w:color="8A9BB0" w:sz="4"/>
+            <w:tcW w:type="dxa" w:w="4248"/>
+            <w:tcBorders>
+              <w:top w:val="single"/>
+              <w:left w:val="single"/>
+              <w:bottom w:val="single"/>
+              <w:right w:val="single"/>
             </w:tcBorders>
             <w:tcMar>
               <w:top w:type="dxa" w:w="60"/>
@@ -2441,8 +2395,8 @@
               <w:rPr>
                 <w:b/>
                 <w:bCs/>
-                <w:sz w:val="18"/>
-                <w:szCs w:val="18"/>
+                <w:sz w:val="20"/>
+                <w:szCs w:val="20"/>
               </w:rPr>
               <w:t xml:space="preserve">Total</w:t>
             </w:r>
@@ -2450,27 +2404,27 @@
         </w:tc>
         <w:tc>
           <w:tcPr>
-            <w:tcW w:type="dxa" w:w="1800"/>
-            <w:tcBorders>
-              <w:top w:val="single" w:color="8A9BB0" w:sz="4"/>
-              <w:left w:val="single" w:color="8A9BB0" w:sz="4"/>
-              <w:bottom w:val="single" w:color="8A9BB0" w:sz="4"/>
-              <w:right w:val="single" w:color="8A9BB0" w:sz="4"/>
-            </w:tcBorders>
-            <w:tcMar>
-              <w:top w:type="dxa" w:w="60"/>
-              <w:left w:type="dxa" w:w="90"/>
-              <w:bottom w:type="dxa" w:w="60"/>
-              <w:right w:type="dxa" w:w="90"/>
-            </w:tcMar>
-          </w:tcPr>
-          <w:p>
-            <w:r>
-              <w:rPr>
-                <w:b w:val="false"/>
-                <w:bCs w:val="false"/>
-                <w:sz w:val="18"/>
-                <w:szCs w:val="18"/>
+            <w:tcW w:type="dxa" w:w="2389"/>
+            <w:tcBorders>
+              <w:top w:val="single"/>
+              <w:left w:val="single"/>
+              <w:bottom w:val="single"/>
+              <w:right w:val="single"/>
+            </w:tcBorders>
+            <w:tcMar>
+              <w:top w:type="dxa" w:w="60"/>
+              <w:left w:type="dxa" w:w="90"/>
+              <w:bottom w:type="dxa" w:w="60"/>
+              <w:right w:type="dxa" w:w="90"/>
+            </w:tcMar>
+          </w:tcPr>
+          <w:p>
+            <w:r>
+              <w:rPr>
+                <w:b w:val="false"/>
+                <w:bCs w:val="false"/>
+                <w:sz w:val="20"/>
+                <w:szCs w:val="20"/>
               </w:rPr>
               <w:t xml:space="preserve">28</w:t>
             </w:r>
@@ -2478,27 +2432,27 @@
         </w:tc>
         <w:tc>
           <w:tcPr>
-            <w:tcW w:type="dxa" w:w="1800"/>
-            <w:tcBorders>
-              <w:top w:val="single" w:color="8A9BB0" w:sz="4"/>
-              <w:left w:val="single" w:color="8A9BB0" w:sz="4"/>
-              <w:bottom w:val="single" w:color="8A9BB0" w:sz="4"/>
-              <w:right w:val="single" w:color="8A9BB0" w:sz="4"/>
-            </w:tcBorders>
-            <w:tcMar>
-              <w:top w:type="dxa" w:w="60"/>
-              <w:left w:type="dxa" w:w="90"/>
-              <w:bottom w:type="dxa" w:w="60"/>
-              <w:right w:type="dxa" w:w="90"/>
-            </w:tcMar>
-          </w:tcPr>
-          <w:p>
-            <w:r>
-              <w:rPr>
-                <w:b w:val="false"/>
-                <w:bCs w:val="false"/>
-                <w:sz w:val="18"/>
-                <w:szCs w:val="18"/>
+            <w:tcW w:type="dxa" w:w="2389"/>
+            <w:tcBorders>
+              <w:top w:val="single"/>
+              <w:left w:val="single"/>
+              <w:bottom w:val="single"/>
+              <w:right w:val="single"/>
+            </w:tcBorders>
+            <w:tcMar>
+              <w:top w:type="dxa" w:w="60"/>
+              <w:left w:type="dxa" w:w="90"/>
+              <w:bottom w:type="dxa" w:w="60"/>
+              <w:right w:type="dxa" w:w="90"/>
+            </w:tcMar>
+          </w:tcPr>
+          <w:p>
+            <w:r>
+              <w:rPr>
+                <w:b w:val="false"/>
+                <w:bCs w:val="false"/>
+                <w:sz w:val="20"/>
+                <w:szCs w:val="20"/>
               </w:rPr>
               <w:t xml:space="preserve">100%</w:t>
             </w:r>
@@ -2515,8 +2469,6 @@
         <w:rPr>
           <w:i/>
           <w:iCs/>
-          <w:sz w:val="20"/>
-          <w:szCs w:val="20"/>
         </w:rPr>
         <w:t xml:space="preserve">Table 2. Calls per agent (LLM and tools). The largest share is 29%, below the 40% limit.</w:t>
       </w:r>
@@ -2619,9 +2571,9 @@
       </w:r>
     </w:p>
     <w:sectPr>
-      <w:footerReference w:type="default" r:id="rId8"/>
+      <w:footerReference w:type="default" r:id="rId6"/>
       <w:pgSz w:w="11906" w:h="16838" w:orient="portrait"/>
-      <w:pgMar w:top="1300" w:right="1300" w:bottom="1300" w:left="1300" w:header="708" w:footer="708" w:gutter="0"/>
+      <w:pgMar w:top="1440" w:right="1440" w:bottom="1440" w:left="1440" w:header="708" w:footer="708" w:gutter="0"/>
       <w:pgNumType/>
       <w:docGrid w:linePitch="360"/>
     </w:sectPr>
@@ -2673,50 +2625,6 @@
       <w:jc w:val="center"/>
     </w:pPr>
     <w:r>
-      <w:rPr>
-        <w:sz w:val="18"/>
-        <w:szCs w:val="18"/>
-      </w:rPr>
-      <w:fldChar w:fldCharType="begin"/>
-      <w:instrText xml:space="preserve">PAGE</w:instrText>
-      <w:fldChar w:fldCharType="separate"/>
-      <w:fldChar w:fldCharType="end"/>
-    </w:r>
-  </w:p>
-</w:ftr>
-</file>
-
-<file path=word/footer2.xml><?xml version="1.0" encoding="utf-8"?>
-<w:ftr xmlns:wpc="http://schemas.microsoft.com/office/word/2010/wordprocessingCanvas" xmlns:mc="http://schemas.openxmlformats.org/markup-compatibility/2006" xmlns:o="urn:schemas-microsoft-com:office:office" xmlns:r="http://schemas.openxmlformats.org/officeDocument/2006/relationships" xmlns:m="http://schemas.openxmlformats.org/officeDocument/2006/math" xmlns:v="urn:schemas-microsoft-com:vml" xmlns:wp14="http://schemas.microsoft.com/office/word/2010/wordprocessingDrawing" xmlns:wp="http://schemas.openxmlformats.org/drawingml/2006/wordprocessingDrawing" xmlns:w10="urn:schemas-microsoft-com:office:word" xmlns:w="http://schemas.openxmlformats.org/wordprocessingml/2006/main" xmlns:w14="http://schemas.microsoft.com/office/word/2010/wordml" xmlns:w15="http://schemas.microsoft.com/office/word/2012/wordml" xmlns:wpg="http://schemas.microsoft.com/office/word/2010/wordprocessingGroup" xmlns:wpi="http://schemas.microsoft.com/office/word/2010/wordprocessingInk" xmlns:wne="http://schemas.microsoft.com/office/word/2006/wordml" xmlns:wps="http://schemas.microsoft.com/office/word/2010/wordprocessingShape">
-  <w:p>
-    <w:pPr>
-      <w:jc w:val="center"/>
-    </w:pPr>
-    <w:r>
-      <w:rPr>
-        <w:sz w:val="18"/>
-        <w:szCs w:val="18"/>
-      </w:rPr>
-      <w:fldChar w:fldCharType="begin"/>
-      <w:instrText xml:space="preserve">PAGE</w:instrText>
-      <w:fldChar w:fldCharType="separate"/>
-      <w:fldChar w:fldCharType="end"/>
-    </w:r>
-  </w:p>
-</w:ftr>
-</file>
-
-<file path=word/footer3.xml><?xml version="1.0" encoding="utf-8"?>
-<w:ftr xmlns:wpc="http://schemas.microsoft.com/office/word/2010/wordprocessingCanvas" xmlns:mc="http://schemas.openxmlformats.org/markup-compatibility/2006" xmlns:o="urn:schemas-microsoft-com:office:office" xmlns:r="http://schemas.openxmlformats.org/officeDocument/2006/relationships" xmlns:m="http://schemas.openxmlformats.org/officeDocument/2006/math" xmlns:v="urn:schemas-microsoft-com:vml" xmlns:wp14="http://schemas.microsoft.com/office/word/2010/wordprocessingDrawing" xmlns:wp="http://schemas.openxmlformats.org/drawingml/2006/wordprocessingDrawing" xmlns:w10="urn:schemas-microsoft-com:office:word" xmlns:w="http://schemas.openxmlformats.org/wordprocessingml/2006/main" xmlns:w14="http://schemas.microsoft.com/office/word/2010/wordml" xmlns:w15="http://schemas.microsoft.com/office/word/2012/wordml" xmlns:wpg="http://schemas.microsoft.com/office/word/2010/wordprocessingGroup" xmlns:wpi="http://schemas.microsoft.com/office/word/2010/wordprocessingInk" xmlns:wne="http://schemas.microsoft.com/office/word/2006/wordml" xmlns:wps="http://schemas.microsoft.com/office/word/2010/wordprocessingShape">
-  <w:p>
-    <w:pPr>
-      <w:jc w:val="center"/>
-    </w:pPr>
-    <w:r>
-      <w:rPr>
-        <w:sz w:val="18"/>
-        <w:szCs w:val="18"/>
-      </w:rPr>
       <w:fldChar w:fldCharType="begin"/>
       <w:instrText xml:space="preserve">PAGE</w:instrText>
       <w:fldChar w:fldCharType="separate"/>
@@ -2899,9 +2807,9 @@
   <w:docDefaults>
     <w:rPrDefault>
       <w:rPr>
-        <w:rFonts w:ascii="Calibri" w:cs="Calibri" w:eastAsia="Calibri" w:hAnsi="Calibri"/>
-        <w:sz w:val="23"/>
-        <w:szCs w:val="23"/>
+        <w:rFonts w:ascii="Times New Roman" w:cs="Times New Roman" w:eastAsia="Times New Roman" w:hAnsi="Times New Roman"/>
+        <w:sz w:val="24"/>
+        <w:szCs w:val="24"/>
       </w:rPr>
     </w:rPrDefault>
     <w:pPrDefault/>
@@ -3085,11 +2993,12 @@
       <w:outlineLvl w:val="0"/>
     </w:pPr>
     <w:rPr>
+      <w:rFonts w:ascii="Times New Roman" w:cs="Times New Roman" w:eastAsia="Times New Roman" w:hAnsi="Times New Roman"/>
       <w:b/>
       <w:bCs/>
-      <w:color w:val="1F3A5F"/>
-      <w:sz w:val="30"/>
-      <w:szCs w:val="30"/>
+      <w:color w:val="000000"/>
+      <w:sz w:val="28"/>
+      <w:szCs w:val="28"/>
     </w:rPr>
   </w:style>
   <w:style w:type="paragraph" w:styleId="Heading2">
@@ -3102,11 +3011,12 @@
       <w:outlineLvl w:val="1"/>
     </w:pPr>
     <w:rPr>
+      <w:rFonts w:ascii="Times New Roman" w:cs="Times New Roman" w:eastAsia="Times New Roman" w:hAnsi="Times New Roman"/>
       <w:b/>
       <w:bCs/>
-      <w:color w:val="1F3A5F"/>
-      <w:sz w:val="25"/>
-      <w:szCs w:val="25"/>
+      <w:color w:val="000000"/>
+      <w:sz w:val="24"/>
+      <w:szCs w:val="24"/>
     </w:rPr>
   </w:style>
 </w:styles>

</xml_diff>